<commit_message>
TS 1.3 Tamil Sanskrit Jatai
</commit_message>
<xml_diff>
--- a/TS Jatai Ghanam Project/TS 1.3/TS 1.3 Jatai Tamil Corrections.docx
+++ b/TS Jatai Ghanam Project/TS 1.3/TS 1.3 Jatai Tamil Corrections.docx
@@ -163,136 +163,780 @@
           </w:tcPr>
           <w:p>
             <w:pPr>
-              <w:widowControl w:val="0"/>
               <w:autoSpaceDE w:val="0"/>
               <w:autoSpaceDN w:val="0"/>
               <w:adjustRightInd w:val="0"/>
-              <w:spacing w:line="240" w:lineRule="auto"/>
-              <w:rPr>
-                <w:rFonts w:ascii="BRH Devanagari Extra" w:hAnsi="BRH Devanagari Extra" w:cs="BRH Devanagari Extra"/>
-                <w:color w:val="000000"/>
-                <w:sz w:val="32"/>
-                <w:szCs w:val="40"/>
+              <w:rPr>
+                <w:rFonts w:ascii="Latha" w:hAnsi="Latha" w:cs="Latha"/>
+                <w:szCs w:val="28"/>
+                <w:lang w:bidi="ta-IN"/>
               </w:rPr>
             </w:pPr>
             <w:r>
               <w:rPr>
-                <w:rFonts w:cs="BRH Devanagari Extra"/>
-                <w:color w:val="000000"/>
-                <w:szCs w:val="40"/>
+                <w:rFonts w:cs="Latha"/>
+                <w:b/>
+                <w:bCs/>
+                <w:szCs w:val="28"/>
+                <w:cs/>
+                <w:lang w:bidi="ta-IN"/>
+              </w:rPr>
+              <w:t>6</w:t>
+            </w:r>
+            <w:r>
+              <w:rPr>
+                <w:rFonts w:cs="Latha"/>
+                <w:b/>
+                <w:bCs/>
+                <w:szCs w:val="28"/>
+                <w:lang w:bidi="ta-IN"/>
+              </w:rPr>
+              <w:t>)</w:t>
+            </w:r>
+            <w:r>
+              <w:rPr>
+                <w:rFonts w:ascii="Latha" w:hAnsi="Latha" w:cs="Latha"/>
+                <w:szCs w:val="28"/>
+                <w:lang w:bidi="ta-IN"/>
+              </w:rPr>
+              <w:t xml:space="preserve">    </w:t>
+            </w:r>
+            <w:r>
+              <w:rPr>
+                <w:rFonts w:cs="Latha"/>
+                <w:b/>
+                <w:bCs/>
+                <w:szCs w:val="28"/>
+                <w:cs/>
+                <w:lang w:bidi="ta-IN"/>
+              </w:rPr>
+              <w:t>1.3.7</w:t>
+            </w:r>
+            <w:r>
+              <w:rPr>
+                <w:rFonts w:cs="Latha"/>
+                <w:b/>
+                <w:bCs/>
+                <w:szCs w:val="28"/>
+                <w:lang w:bidi="ta-IN"/>
+              </w:rPr>
+              <w:t>.2</w:t>
+            </w:r>
+            <w:r>
+              <w:rPr>
+                <w:rFonts w:cs="Latha"/>
+                <w:b/>
+                <w:bCs/>
+                <w:szCs w:val="28"/>
+                <w:lang w:bidi="ta-IN"/>
+              </w:rPr>
+              <w:t>(</w:t>
+            </w:r>
+            <w:r>
+              <w:rPr>
+                <w:rFonts w:cs="Latha"/>
+                <w:b/>
+                <w:bCs/>
+                <w:szCs w:val="28"/>
+                <w:cs/>
+                <w:lang w:bidi="ta-IN"/>
+              </w:rPr>
+              <w:t>4)</w:t>
+            </w:r>
+            <w:r>
+              <w:rPr>
+                <w:rFonts w:ascii="Latha" w:hAnsi="Latha" w:cs="Latha"/>
+                <w:szCs w:val="28"/>
+                <w:lang w:bidi="ta-IN"/>
+              </w:rPr>
+              <w:t xml:space="preserve">- </w:t>
+            </w:r>
+            <w:r>
+              <w:rPr>
+                <w:rFonts w:ascii="Latha" w:hAnsi="Latha" w:cs="Latha"/>
+                <w:szCs w:val="28"/>
+                <w:cs/>
+                <w:lang w:bidi="ta-IN"/>
+              </w:rPr>
+              <w:t>அ</w:t>
+            </w:r>
+            <w:r>
+              <w:rPr>
+                <w:rFonts w:ascii="BRH Tamil Tab Extra" w:hAnsi="BRH Tamil Tab Extra" w:cs="Latha"/>
+                <w:b/>
+                <w:bCs/>
+                <w:sz w:val="32"/>
+                <w:szCs w:val="28"/>
+                <w:lang w:bidi="ta-IN"/>
+              </w:rPr>
+              <w:t>…</w:t>
+            </w:r>
+            <w:r>
+              <w:rPr>
+                <w:rFonts w:ascii="Latha" w:hAnsi="Latha" w:cs="Latha"/>
+                <w:szCs w:val="28"/>
+                <w:cs/>
+                <w:lang w:bidi="ta-IN"/>
+              </w:rPr>
+              <w:t>ரே</w:t>
+            </w:r>
+            <w:r>
+              <w:rPr>
+                <w:rFonts w:ascii="BRH Tamil Tab Extra" w:hAnsi="BRH Tamil Tab Extra" w:cs="Latha"/>
+                <w:b/>
+                <w:bCs/>
+                <w:sz w:val="32"/>
+                <w:szCs w:val="28"/>
+                <w:lang w:bidi="ta-IN"/>
+              </w:rPr>
+              <w:t>…</w:t>
+            </w:r>
+            <w:r>
+              <w:rPr>
+                <w:rFonts w:ascii="Latha" w:hAnsi="Latha" w:cs="Latha"/>
+                <w:szCs w:val="28"/>
+                <w:cs/>
+                <w:lang w:bidi="ta-IN"/>
+              </w:rPr>
+              <w:t>பஸௌ</w:t>
+            </w:r>
+            <w:r>
+              <w:rPr>
+                <w:rFonts w:ascii="BRH Tamil Tab Extra" w:hAnsi="BRH Tamil Tab Extra" w:cs="Latha"/>
+                <w:b/>
+                <w:bCs/>
+                <w:sz w:val="32"/>
+                <w:szCs w:val="28"/>
+                <w:lang w:bidi="ta-IN"/>
+              </w:rPr>
+              <w:t>‡</w:t>
+            </w:r>
+            <w:r>
+              <w:rPr>
+                <w:rFonts w:ascii="Latha" w:hAnsi="Latha" w:cs="Latha"/>
+                <w:szCs w:val="28"/>
+                <w:lang w:bidi="ta-IN"/>
+              </w:rPr>
+              <w:t xml:space="preserve"> ||</w:t>
+            </w:r>
+          </w:p>
+          <w:p>
+            <w:pPr>
+              <w:autoSpaceDE w:val="0"/>
+              <w:autoSpaceDN w:val="0"/>
+              <w:adjustRightInd w:val="0"/>
+              <w:rPr>
+                <w:rFonts w:cs="Latha"/>
+                <w:b/>
+                <w:bCs/>
+                <w:szCs w:val="28"/>
+                <w:cs/>
+                <w:lang w:bidi="ta-IN"/>
+              </w:rPr>
+            </w:pPr>
+            <w:r>
+              <w:rPr>
+                <w:rFonts w:ascii="Latha" w:hAnsi="Latha" w:cs="Latha"/>
+                <w:szCs w:val="28"/>
+                <w:cs/>
+                <w:lang w:bidi="ta-IN"/>
+              </w:rPr>
+              <w:t>அ</w:t>
+            </w:r>
+            <w:r>
+              <w:rPr>
+                <w:rFonts w:ascii="BRH Tamil Tab Extra" w:hAnsi="BRH Tamil Tab Extra" w:cs="Latha"/>
+                <w:b/>
+                <w:bCs/>
+                <w:sz w:val="32"/>
+                <w:szCs w:val="28"/>
+                <w:lang w:bidi="ta-IN"/>
+              </w:rPr>
+              <w:t>…</w:t>
+            </w:r>
+            <w:r>
+              <w:rPr>
+                <w:rFonts w:ascii="Latha" w:hAnsi="Latha" w:cs="Latha"/>
+                <w:szCs w:val="28"/>
+                <w:cs/>
+                <w:lang w:bidi="ta-IN"/>
+              </w:rPr>
+              <w:t>ரே</w:t>
+            </w:r>
+            <w:r>
+              <w:rPr>
+                <w:rFonts w:ascii="BRH Tamil Tab Extra" w:hAnsi="BRH Tamil Tab Extra" w:cs="Latha"/>
+                <w:b/>
+                <w:bCs/>
+                <w:sz w:val="32"/>
+                <w:szCs w:val="28"/>
+                <w:lang w:bidi="ta-IN"/>
+              </w:rPr>
+              <w:t>…</w:t>
+            </w:r>
+            <w:r>
+              <w:rPr>
+                <w:rFonts w:ascii="Latha" w:hAnsi="Latha" w:cs="Latha"/>
+                <w:szCs w:val="28"/>
+                <w:cs/>
+                <w:lang w:bidi="ta-IN"/>
+              </w:rPr>
+              <w:t>ப</w:t>
+            </w:r>
+            <w:r>
+              <w:rPr>
+                <w:rFonts w:ascii="Latha" w:hAnsi="Latha" w:cs="Latha"/>
+                <w:szCs w:val="28"/>
+                <w:highlight w:val="yellow"/>
+                <w:cs/>
+                <w:lang w:bidi="ta-IN"/>
+              </w:rPr>
+              <w:t>ஸா</w:t>
+            </w:r>
+            <w:r>
+              <w:rPr>
+                <w:rFonts w:ascii="Latha" w:hAnsi="Latha" w:cs="Latha"/>
+                <w:szCs w:val="28"/>
+                <w:cs/>
+                <w:lang w:bidi="ta-IN"/>
+              </w:rPr>
+              <w:t>வித்ய</w:t>
+            </w:r>
+            <w:r>
+              <w:rPr>
+                <w:rFonts w:ascii="BRH Tamil Tab Extra" w:hAnsi="BRH Tamil Tab Extra" w:cs="Latha"/>
+                <w:b/>
+                <w:bCs/>
+                <w:sz w:val="32"/>
+                <w:szCs w:val="28"/>
+                <w:lang w:bidi="ta-IN"/>
+              </w:rPr>
+              <w:t>†</w:t>
+            </w:r>
+            <w:r>
+              <w:rPr>
+                <w:rFonts w:ascii="Latha" w:hAnsi="Latha" w:cs="Latha"/>
+                <w:szCs w:val="28"/>
+                <w:cs/>
+                <w:lang w:bidi="ta-IN"/>
+              </w:rPr>
+              <w:t>ரே</w:t>
+            </w:r>
+            <w:r>
+              <w:rPr>
+                <w:rFonts w:ascii="BRH Tamil Tab Extra" w:hAnsi="BRH Tamil Tab Extra" w:cs="Latha"/>
+                <w:b/>
+                <w:bCs/>
+                <w:sz w:val="32"/>
+                <w:szCs w:val="28"/>
+                <w:lang w:bidi="ta-IN"/>
+              </w:rPr>
+              <w:t>…</w:t>
+            </w:r>
+            <w:r>
+              <w:rPr>
+                <w:rFonts w:ascii="Latha" w:hAnsi="Latha" w:cs="Latha"/>
+                <w:szCs w:val="28"/>
+                <w:cs/>
+                <w:lang w:bidi="ta-IN"/>
+              </w:rPr>
+              <w:t>பஸௌ</w:t>
+            </w:r>
+            <w:r>
+              <w:rPr>
+                <w:rFonts w:ascii="BRH Tamil Tab Extra" w:hAnsi="BRH Tamil Tab Extra" w:cs="Latha"/>
+                <w:b/>
+                <w:bCs/>
+                <w:sz w:val="32"/>
+                <w:szCs w:val="28"/>
+                <w:lang w:bidi="ta-IN"/>
+              </w:rPr>
+              <w:t>‡</w:t>
+            </w:r>
+            <w:r>
+              <w:rPr>
+                <w:rFonts w:ascii="Latha" w:hAnsi="Latha" w:cs="Latha"/>
+                <w:szCs w:val="28"/>
+                <w:lang w:bidi="ta-IN"/>
+              </w:rPr>
+              <w:t xml:space="preserve"> |</w:t>
+            </w:r>
+          </w:p>
+        </w:tc>
+        <w:tc>
+          <w:tcPr>
+            <w:tcW w:w="7087" w:type="dxa"/>
+          </w:tcPr>
+          <w:p>
+            <w:pPr>
+              <w:autoSpaceDE w:val="0"/>
+              <w:autoSpaceDN w:val="0"/>
+              <w:adjustRightInd w:val="0"/>
+              <w:rPr>
+                <w:rFonts w:ascii="Latha" w:hAnsi="Latha" w:cs="Latha"/>
+                <w:szCs w:val="28"/>
+                <w:lang w:bidi="ta-IN"/>
+              </w:rPr>
+            </w:pPr>
+            <w:r>
+              <w:rPr>
+                <w:rFonts w:cs="Latha"/>
+                <w:b/>
+                <w:bCs/>
+                <w:szCs w:val="28"/>
+                <w:cs/>
+                <w:lang w:bidi="ta-IN"/>
+              </w:rPr>
+              <w:t>6</w:t>
+            </w:r>
+            <w:r>
+              <w:rPr>
+                <w:rFonts w:cs="Latha"/>
+                <w:b/>
+                <w:bCs/>
+                <w:szCs w:val="28"/>
+                <w:lang w:bidi="ta-IN"/>
+              </w:rPr>
+              <w:t>)</w:t>
+            </w:r>
+            <w:r>
+              <w:rPr>
+                <w:rFonts w:ascii="Latha" w:hAnsi="Latha" w:cs="Latha"/>
+                <w:szCs w:val="28"/>
+                <w:lang w:bidi="ta-IN"/>
+              </w:rPr>
+              <w:t xml:space="preserve">    </w:t>
+            </w:r>
+            <w:r>
+              <w:rPr>
+                <w:rFonts w:cs="Latha"/>
+                <w:b/>
+                <w:bCs/>
+                <w:szCs w:val="28"/>
+                <w:cs/>
+                <w:lang w:bidi="ta-IN"/>
+              </w:rPr>
+              <w:t>1.3.7</w:t>
+            </w:r>
+            <w:r>
+              <w:rPr>
+                <w:rFonts w:cs="Latha"/>
+                <w:b/>
+                <w:bCs/>
+                <w:szCs w:val="28"/>
+                <w:lang w:bidi="ta-IN"/>
+              </w:rPr>
+              <w:t>.2</w:t>
+            </w:r>
+            <w:r>
+              <w:rPr>
+                <w:rFonts w:cs="Latha"/>
+                <w:b/>
+                <w:bCs/>
+                <w:szCs w:val="28"/>
+                <w:lang w:bidi="ta-IN"/>
+              </w:rPr>
+              <w:t>(</w:t>
+            </w:r>
+            <w:r>
+              <w:rPr>
+                <w:rFonts w:cs="Latha"/>
+                <w:b/>
+                <w:bCs/>
+                <w:szCs w:val="28"/>
+                <w:cs/>
+                <w:lang w:bidi="ta-IN"/>
+              </w:rPr>
+              <w:t>4)</w:t>
+            </w:r>
+            <w:r>
+              <w:rPr>
+                <w:rFonts w:ascii="Latha" w:hAnsi="Latha" w:cs="Latha"/>
+                <w:szCs w:val="28"/>
+                <w:lang w:bidi="ta-IN"/>
+              </w:rPr>
+              <w:t xml:space="preserve">- </w:t>
+            </w:r>
+            <w:r>
+              <w:rPr>
+                <w:rFonts w:ascii="Latha" w:hAnsi="Latha" w:cs="Latha"/>
+                <w:szCs w:val="28"/>
+                <w:cs/>
+                <w:lang w:bidi="ta-IN"/>
+              </w:rPr>
+              <w:t>அ</w:t>
+            </w:r>
+            <w:r>
+              <w:rPr>
+                <w:rFonts w:ascii="BRH Tamil Tab Extra" w:hAnsi="BRH Tamil Tab Extra" w:cs="Latha"/>
+                <w:b/>
+                <w:bCs/>
+                <w:sz w:val="32"/>
+                <w:szCs w:val="28"/>
+                <w:lang w:bidi="ta-IN"/>
+              </w:rPr>
+              <w:t>…</w:t>
+            </w:r>
+            <w:r>
+              <w:rPr>
+                <w:rFonts w:ascii="Latha" w:hAnsi="Latha" w:cs="Latha"/>
+                <w:szCs w:val="28"/>
+                <w:cs/>
+                <w:lang w:bidi="ta-IN"/>
+              </w:rPr>
+              <w:t>ரே</w:t>
+            </w:r>
+            <w:r>
+              <w:rPr>
+                <w:rFonts w:ascii="BRH Tamil Tab Extra" w:hAnsi="BRH Tamil Tab Extra" w:cs="Latha"/>
+                <w:b/>
+                <w:bCs/>
+                <w:sz w:val="32"/>
+                <w:szCs w:val="28"/>
+                <w:lang w:bidi="ta-IN"/>
+              </w:rPr>
+              <w:t>…</w:t>
+            </w:r>
+            <w:r>
+              <w:rPr>
+                <w:rFonts w:ascii="Latha" w:hAnsi="Latha" w:cs="Latha"/>
+                <w:szCs w:val="28"/>
+                <w:cs/>
+                <w:lang w:bidi="ta-IN"/>
+              </w:rPr>
+              <w:t>பஸௌ</w:t>
+            </w:r>
+            <w:r>
+              <w:rPr>
+                <w:rFonts w:ascii="BRH Tamil Tab Extra" w:hAnsi="BRH Tamil Tab Extra" w:cs="Latha"/>
+                <w:b/>
+                <w:bCs/>
+                <w:sz w:val="32"/>
+                <w:szCs w:val="28"/>
+                <w:lang w:bidi="ta-IN"/>
+              </w:rPr>
+              <w:t>‡</w:t>
+            </w:r>
+            <w:r>
+              <w:rPr>
+                <w:rFonts w:ascii="Latha" w:hAnsi="Latha" w:cs="Latha"/>
+                <w:szCs w:val="28"/>
+                <w:lang w:bidi="ta-IN"/>
+              </w:rPr>
+              <w:t xml:space="preserve"> ||</w:t>
+            </w:r>
+          </w:p>
+          <w:p>
+            <w:pPr>
+              <w:autoSpaceDE w:val="0"/>
+              <w:autoSpaceDN w:val="0"/>
+              <w:adjustRightInd w:val="0"/>
+              <w:rPr>
+                <w:rFonts w:cs="Latha"/>
+                <w:b/>
+                <w:bCs/>
+                <w:szCs w:val="28"/>
+                <w:cs/>
+                <w:lang w:bidi="ta-IN"/>
+              </w:rPr>
+            </w:pPr>
+            <w:r>
+              <w:rPr>
+                <w:rFonts w:ascii="Latha" w:hAnsi="Latha" w:cs="Latha"/>
+                <w:szCs w:val="28"/>
+                <w:cs/>
+                <w:lang w:bidi="ta-IN"/>
+              </w:rPr>
+              <w:t>அ</w:t>
+            </w:r>
+            <w:r>
+              <w:rPr>
+                <w:rFonts w:ascii="BRH Tamil Tab Extra" w:hAnsi="BRH Tamil Tab Extra" w:cs="Latha"/>
+                <w:b/>
+                <w:bCs/>
+                <w:sz w:val="32"/>
+                <w:szCs w:val="28"/>
+                <w:lang w:bidi="ta-IN"/>
+              </w:rPr>
+              <w:t>…</w:t>
+            </w:r>
+            <w:r>
+              <w:rPr>
+                <w:rFonts w:ascii="Latha" w:hAnsi="Latha" w:cs="Latha"/>
+                <w:szCs w:val="28"/>
+                <w:cs/>
+                <w:lang w:bidi="ta-IN"/>
+              </w:rPr>
+              <w:t>ரே</w:t>
+            </w:r>
+            <w:r>
+              <w:rPr>
+                <w:rFonts w:ascii="BRH Tamil Tab Extra" w:hAnsi="BRH Tamil Tab Extra" w:cs="Latha"/>
+                <w:b/>
+                <w:bCs/>
+                <w:sz w:val="32"/>
+                <w:szCs w:val="28"/>
+                <w:lang w:bidi="ta-IN"/>
+              </w:rPr>
+              <w:t>…</w:t>
+            </w:r>
+            <w:r>
+              <w:rPr>
+                <w:rFonts w:ascii="Latha" w:hAnsi="Latha" w:cs="Latha"/>
+                <w:szCs w:val="28"/>
+                <w:cs/>
+                <w:lang w:bidi="ta-IN"/>
+              </w:rPr>
+              <w:t>ப</w:t>
+            </w:r>
+            <w:r>
+              <w:rPr>
+                <w:rFonts w:ascii="Latha" w:hAnsi="Latha" w:cs="Latha"/>
+                <w:szCs w:val="28"/>
+                <w:highlight w:val="green"/>
+                <w:cs/>
+                <w:lang w:bidi="ta-IN"/>
+              </w:rPr>
+              <w:t>ஸா</w:t>
+            </w:r>
+            <w:r>
+              <w:rPr>
+                <w:rFonts w:ascii="BRH Tamil Tab Extra" w:hAnsi="BRH Tamil Tab Extra" w:cs="Latha"/>
+                <w:b/>
+                <w:bCs/>
+                <w:sz w:val="32"/>
+                <w:szCs w:val="28"/>
+                <w:lang w:bidi="ta-IN"/>
+              </w:rPr>
+              <w:t>…</w:t>
+            </w:r>
+            <w:r>
+              <w:rPr>
+                <w:rFonts w:ascii="Latha" w:hAnsi="Latha" w:cs="Latha"/>
+                <w:szCs w:val="28"/>
+                <w:cs/>
+                <w:lang w:bidi="ta-IN"/>
+              </w:rPr>
+              <w:t>வித்ய</w:t>
+            </w:r>
+            <w:r>
+              <w:rPr>
+                <w:rFonts w:ascii="BRH Tamil Tab Extra" w:hAnsi="BRH Tamil Tab Extra" w:cs="Latha"/>
+                <w:b/>
+                <w:bCs/>
+                <w:sz w:val="32"/>
+                <w:szCs w:val="28"/>
+                <w:lang w:bidi="ta-IN"/>
+              </w:rPr>
+              <w:t>†</w:t>
+            </w:r>
+            <w:r>
+              <w:rPr>
+                <w:rFonts w:ascii="Latha" w:hAnsi="Latha" w:cs="Latha"/>
+                <w:szCs w:val="28"/>
+                <w:cs/>
+                <w:lang w:bidi="ta-IN"/>
+              </w:rPr>
+              <w:t>ரே</w:t>
+            </w:r>
+            <w:r>
+              <w:rPr>
+                <w:rFonts w:ascii="BRH Tamil Tab Extra" w:hAnsi="BRH Tamil Tab Extra" w:cs="Latha"/>
+                <w:b/>
+                <w:bCs/>
+                <w:sz w:val="32"/>
+                <w:szCs w:val="28"/>
+                <w:lang w:bidi="ta-IN"/>
+              </w:rPr>
+              <w:t>…</w:t>
+            </w:r>
+            <w:r>
+              <w:rPr>
+                <w:rFonts w:ascii="Latha" w:hAnsi="Latha" w:cs="Latha"/>
+                <w:szCs w:val="28"/>
+                <w:cs/>
+                <w:lang w:bidi="ta-IN"/>
+              </w:rPr>
+              <w:t>பஸௌ</w:t>
+            </w:r>
+            <w:r>
+              <w:rPr>
+                <w:rFonts w:ascii="BRH Tamil Tab Extra" w:hAnsi="BRH Tamil Tab Extra" w:cs="Latha"/>
+                <w:b/>
+                <w:bCs/>
+                <w:sz w:val="32"/>
+                <w:szCs w:val="28"/>
+                <w:lang w:bidi="ta-IN"/>
+              </w:rPr>
+              <w:t>‡</w:t>
+            </w:r>
+            <w:r>
+              <w:rPr>
+                <w:rFonts w:ascii="Latha" w:hAnsi="Latha" w:cs="Latha"/>
+                <w:szCs w:val="28"/>
+                <w:lang w:bidi="ta-IN"/>
+              </w:rPr>
+              <w:t xml:space="preserve"> |</w:t>
+            </w:r>
+          </w:p>
+        </w:tc>
+      </w:tr>
+      <w:tr>
+        <w:trPr>
+          <w:trHeight w:val="1480"/>
+        </w:trPr>
+        <w:tc>
+          <w:tcPr>
+            <w:tcW w:w="6883" w:type="dxa"/>
+          </w:tcPr>
+          <w:p>
+            <w:pPr>
+              <w:autoSpaceDE w:val="0"/>
+              <w:autoSpaceDN w:val="0"/>
+              <w:adjustRightInd w:val="0"/>
+              <w:rPr>
+                <w:rFonts w:ascii="Latha" w:hAnsi="Latha" w:cs="Latha"/>
+                <w:szCs w:val="28"/>
+                <w:lang w:bidi="ta-IN"/>
+              </w:rPr>
+            </w:pPr>
+            <w:r>
+              <w:rPr>
+                <w:rFonts w:cs="Latha"/>
+                <w:b/>
+                <w:bCs/>
+                <w:szCs w:val="28"/>
+                <w:cs/>
+                <w:lang w:bidi="ta-IN"/>
               </w:rPr>
               <w:t>5</w:t>
             </w:r>
             <w:r>
               <w:rPr>
-                <w:rFonts w:ascii="BRH Devanagari Extra" w:hAnsi="BRH Devanagari Extra" w:cs="BRH Devanagari Extra"/>
-                <w:color w:val="000000"/>
-                <w:sz w:val="32"/>
-                <w:szCs w:val="40"/>
-              </w:rPr>
-              <w:t xml:space="preserve">)   </w:t>
-            </w:r>
-            <w:r>
-              <w:rPr>
-                <w:rFonts w:cs="BRH Devanagari Extra"/>
-                <w:color w:val="000000"/>
-                <w:szCs w:val="40"/>
-              </w:rPr>
-              <w:t>1</w:t>
-            </w:r>
-            <w:r>
-              <w:rPr>
-                <w:rFonts w:ascii="BRH Devanagari Extra" w:hAnsi="BRH Devanagari Extra" w:cs="BRH Devanagari Extra"/>
-                <w:color w:val="000000"/>
-                <w:sz w:val="32"/>
-                <w:szCs w:val="40"/>
-              </w:rPr>
-              <w:t>.</w:t>
-            </w:r>
-            <w:r>
-              <w:rPr>
-                <w:rFonts w:cs="BRH Devanagari Extra"/>
-                <w:color w:val="000000"/>
-                <w:szCs w:val="40"/>
+                <w:rFonts w:cs="Latha"/>
+                <w:b/>
+                <w:bCs/>
+                <w:szCs w:val="28"/>
+                <w:lang w:bidi="ta-IN"/>
+              </w:rPr>
+              <w:t>)</w:t>
+            </w:r>
+            <w:r>
+              <w:rPr>
+                <w:rFonts w:ascii="Latha" w:hAnsi="Latha" w:cs="Latha"/>
+                <w:szCs w:val="28"/>
+                <w:lang w:bidi="ta-IN"/>
+              </w:rPr>
+              <w:t xml:space="preserve">    </w:t>
+            </w:r>
+            <w:r>
+              <w:rPr>
+                <w:rFonts w:cs="Latha"/>
+                <w:b/>
+                <w:bCs/>
+                <w:szCs w:val="28"/>
+                <w:cs/>
+                <w:lang w:bidi="ta-IN"/>
+              </w:rPr>
+              <w:t>1.3.</w:t>
+            </w:r>
+            <w:r>
+              <w:rPr>
+                <w:rFonts w:cs="Latha"/>
+                <w:b/>
+                <w:bCs/>
+                <w:szCs w:val="28"/>
+                <w:cs/>
+                <w:lang w:bidi="ta-IN"/>
+              </w:rPr>
+              <w:t>14</w:t>
+            </w:r>
+            <w:r>
+              <w:rPr>
+                <w:rFonts w:cs="Latha"/>
+                <w:b/>
+                <w:bCs/>
+                <w:szCs w:val="28"/>
+                <w:lang w:bidi="ta-IN"/>
+              </w:rPr>
+              <w:t>.4</w:t>
+            </w:r>
+            <w:r>
+              <w:rPr>
+                <w:rFonts w:cs="Latha"/>
+                <w:b/>
+                <w:bCs/>
+                <w:szCs w:val="28"/>
+                <w:lang w:bidi="ta-IN"/>
+              </w:rPr>
+              <w:t>(</w:t>
+            </w:r>
+            <w:r>
+              <w:rPr>
+                <w:rFonts w:cs="Latha"/>
+                <w:b/>
+                <w:bCs/>
+                <w:szCs w:val="28"/>
+                <w:cs/>
+                <w:lang w:bidi="ta-IN"/>
               </w:rPr>
               <w:t>3</w:t>
             </w:r>
             <w:r>
               <w:rPr>
-                <w:rFonts w:ascii="BRH Devanagari Extra" w:hAnsi="BRH Devanagari Extra" w:cs="BRH Devanagari Extra"/>
-                <w:color w:val="000000"/>
-                <w:sz w:val="32"/>
-                <w:szCs w:val="40"/>
-              </w:rPr>
-              <w:t>.</w:t>
-            </w:r>
-            <w:r>
-              <w:rPr>
-                <w:rFonts w:cs="BRH Devanagari Extra"/>
-                <w:color w:val="000000"/>
-                <w:szCs w:val="40"/>
-              </w:rPr>
-              <w:t>14</w:t>
-            </w:r>
-            <w:r>
-              <w:rPr>
-                <w:rFonts w:ascii="BRH Devanagari Extra" w:hAnsi="BRH Devanagari Extra" w:cs="BRH Devanagari Extra"/>
-                <w:color w:val="000000"/>
-                <w:sz w:val="32"/>
-                <w:szCs w:val="40"/>
-              </w:rPr>
-              <w:t>.</w:t>
-            </w:r>
-            <w:r>
-              <w:rPr>
-                <w:rFonts w:cs="BRH Devanagari Extra"/>
-                <w:color w:val="000000"/>
-                <w:szCs w:val="40"/>
-              </w:rPr>
-              <w:t>4</w:t>
-            </w:r>
-            <w:r>
-              <w:rPr>
-                <w:rFonts w:ascii="BRH Devanagari Extra" w:hAnsi="BRH Devanagari Extra" w:cs="BRH Devanagari Extra"/>
-                <w:color w:val="000000"/>
-                <w:sz w:val="32"/>
-                <w:szCs w:val="40"/>
-              </w:rPr>
-              <w:t>(</w:t>
-            </w:r>
-            <w:r>
-              <w:rPr>
-                <w:rFonts w:cs="BRH Devanagari Extra"/>
-                <w:color w:val="000000"/>
-                <w:szCs w:val="40"/>
-              </w:rPr>
-              <w:t>3</w:t>
-            </w:r>
-            <w:r>
-              <w:rPr>
-                <w:rFonts w:ascii="BRH Devanagari Extra" w:hAnsi="BRH Devanagari Extra" w:cs="BRH Devanagari Extra"/>
-                <w:color w:val="000000"/>
-                <w:sz w:val="32"/>
-                <w:szCs w:val="40"/>
-              </w:rPr>
-              <w:t>)- U</w:t>
-            </w:r>
-            <w:r>
-              <w:rPr>
-                <w:rFonts w:ascii="BRH Malayalam Extra" w:hAnsi="BRH Malayalam Extra" w:cs="BRH Devanagari Extra"/>
-                <w:color w:val="000000"/>
-                <w:szCs w:val="40"/>
-              </w:rPr>
-              <w:t>–</w:t>
-            </w:r>
-            <w:r>
-              <w:rPr>
-                <w:rFonts w:ascii="BRH Devanagari Extra" w:hAnsi="BRH Devanagari Extra" w:cs="BRH Devanagari Extra"/>
-                <w:color w:val="000000"/>
-                <w:sz w:val="32"/>
-                <w:szCs w:val="40"/>
-              </w:rPr>
-              <w:t>ÌrÉqÉç ||</w:t>
+                <w:rFonts w:cs="Latha"/>
+                <w:b/>
+                <w:bCs/>
+                <w:szCs w:val="28"/>
+                <w:cs/>
+                <w:lang w:bidi="ta-IN"/>
+              </w:rPr>
+              <w:t>)</w:t>
+            </w:r>
+            <w:r>
+              <w:rPr>
+                <w:rFonts w:ascii="Latha" w:hAnsi="Latha" w:cs="Latha"/>
+                <w:szCs w:val="28"/>
+                <w:lang w:bidi="ta-IN"/>
+              </w:rPr>
+              <w:t xml:space="preserve">- </w:t>
+            </w:r>
+            <w:r>
+              <w:rPr>
+                <w:rFonts w:ascii="Latha" w:hAnsi="Latha" w:cs="Latha"/>
+                <w:szCs w:val="28"/>
+                <w:cs/>
+                <w:lang w:bidi="ta-IN"/>
+              </w:rPr>
+              <w:t>ர</w:t>
+            </w:r>
+            <w:r>
+              <w:rPr>
+                <w:rFonts w:ascii="BRH Tamil Tab Extra" w:hAnsi="BRH Tamil Tab Extra" w:cs="Latha"/>
+                <w:b/>
+                <w:bCs/>
+                <w:sz w:val="32"/>
+                <w:szCs w:val="28"/>
+                <w:lang w:bidi="ta-IN"/>
+              </w:rPr>
+              <w:t>…</w:t>
+            </w:r>
+            <w:r>
+              <w:rPr>
+                <w:rFonts w:ascii="Latha" w:hAnsi="Latha" w:cs="Latha"/>
+                <w:szCs w:val="28"/>
+                <w:cs/>
+                <w:lang w:bidi="ta-IN"/>
+              </w:rPr>
+              <w:t xml:space="preserve">யிம் </w:t>
+            </w:r>
+            <w:r>
+              <w:rPr>
+                <w:rFonts w:ascii="Latha" w:hAnsi="Latha" w:cs="Latha"/>
+                <w:szCs w:val="28"/>
+                <w:lang w:bidi="ta-IN"/>
+              </w:rPr>
+              <w:t>||</w:t>
             </w:r>
           </w:p>
           <w:p>
@@ -314,48 +958,78 @@
             </w:pPr>
             <w:r>
               <w:rPr>
-                <w:rFonts w:ascii="BRH Devanagari Extra" w:hAnsi="BRH Devanagari Extra" w:cs="BRH Devanagari Extra"/>
-                <w:color w:val="000000"/>
-                <w:sz w:val="32"/>
-                <w:szCs w:val="40"/>
-              </w:rPr>
-              <w:t>U</w:t>
-            </w:r>
-            <w:r>
-              <w:rPr>
-                <w:rFonts w:ascii="BRH Malayalam Extra" w:hAnsi="BRH Malayalam Extra" w:cs="BRH Devanagari Extra"/>
-                <w:color w:val="000000"/>
-                <w:szCs w:val="40"/>
-              </w:rPr>
-              <w:t>–</w:t>
-            </w:r>
-            <w:r>
-              <w:rPr>
-                <w:rFonts w:ascii="BRH Devanagari Extra" w:hAnsi="BRH Devanagari Extra" w:cs="BRH Devanagari Extra"/>
-                <w:color w:val="000000"/>
-                <w:sz w:val="32"/>
-                <w:szCs w:val="40"/>
-              </w:rPr>
-              <w:t xml:space="preserve">ÌrÉÍqÉÌiÉþ </w:t>
-            </w:r>
-            <w:r>
-              <w:rPr>
-                <w:rFonts w:ascii="BRH Devanagari Extra" w:hAnsi="BRH Devanagari Extra" w:cs="BRH Devanagari Extra"/>
-                <w:color w:val="000000"/>
-                <w:sz w:val="32"/>
-                <w:szCs w:val="40"/>
+                <w:rFonts w:ascii="Latha" w:hAnsi="Latha" w:cs="Latha"/>
+                <w:szCs w:val="28"/>
+                <w:cs/>
+                <w:lang w:bidi="ta-IN"/>
+              </w:rPr>
+              <w:t>ர</w:t>
+            </w:r>
+            <w:r>
+              <w:rPr>
+                <w:rFonts w:ascii="BRH Tamil Tab Extra" w:hAnsi="BRH Tamil Tab Extra" w:cs="Latha"/>
+                <w:b/>
+                <w:bCs/>
+                <w:sz w:val="32"/>
+                <w:szCs w:val="28"/>
+                <w:lang w:bidi="ta-IN"/>
+              </w:rPr>
+              <w:t>…</w:t>
+            </w:r>
+            <w:r>
+              <w:rPr>
+                <w:rFonts w:ascii="Latha" w:hAnsi="Latha" w:cs="Latha"/>
+                <w:szCs w:val="28"/>
+                <w:cs/>
+                <w:lang w:bidi="ta-IN"/>
+              </w:rPr>
+              <w:t>யிமிதி</w:t>
+            </w:r>
+            <w:r>
+              <w:rPr>
+                <w:rFonts w:ascii="BRH Tamil Tab Extra" w:hAnsi="BRH Tamil Tab Extra" w:cs="Latha"/>
+                <w:b/>
+                <w:bCs/>
+                <w:sz w:val="32"/>
+                <w:szCs w:val="28"/>
+                <w:lang w:bidi="ta-IN"/>
+              </w:rPr>
+              <w:t>†</w:t>
+            </w:r>
+            <w:r>
+              <w:rPr>
+                <w:rFonts w:ascii="Latha" w:hAnsi="Latha" w:cs="Latha"/>
+                <w:szCs w:val="28"/>
+                <w:lang w:bidi="ta-IN"/>
+              </w:rPr>
+              <w:t xml:space="preserve"> </w:t>
+            </w:r>
+            <w:r>
+              <w:rPr>
+                <w:rFonts w:ascii="Latha" w:hAnsi="Latha" w:cs="Latha"/>
+                <w:szCs w:val="28"/>
                 <w:highlight w:val="yellow"/>
-              </w:rPr>
-              <w:t>UÌ</w:t>
-            </w:r>
-            <w:r>
-              <w:rPr>
-                <w:rFonts w:ascii="BRH Devanagari Extra" w:hAnsi="BRH Devanagari Extra" w:cs="BRH Devanagari Extra"/>
-                <w:color w:val="000000"/>
-                <w:sz w:val="32"/>
-                <w:szCs w:val="40"/>
-              </w:rPr>
-              <w:t xml:space="preserve">rÉqÉç | </w:t>
+                <w:cs/>
+                <w:lang w:bidi="ta-IN"/>
+              </w:rPr>
+              <w:t>ர</w:t>
+            </w:r>
+            <w:r>
+              <w:rPr>
+                <w:rFonts w:ascii="Latha" w:hAnsi="Latha" w:cs="Latha"/>
+                <w:szCs w:val="28"/>
+                <w:cs/>
+                <w:lang w:bidi="ta-IN"/>
+              </w:rPr>
+              <w:t xml:space="preserve">யிம் </w:t>
+            </w:r>
+            <w:r>
+              <w:rPr>
+                <w:rFonts w:ascii="Latha" w:hAnsi="Latha" w:cs="Latha"/>
+                <w:szCs w:val="28"/>
+                <w:lang w:bidi="ta-IN"/>
+              </w:rPr>
+              <w:t>|</w:t>
             </w:r>
           </w:p>
         </w:tc>
@@ -365,151 +1039,152 @@
           </w:tcPr>
           <w:p>
             <w:pPr>
-              <w:widowControl w:val="0"/>
               <w:autoSpaceDE w:val="0"/>
               <w:autoSpaceDN w:val="0"/>
               <w:adjustRightInd w:val="0"/>
-              <w:spacing w:line="240" w:lineRule="auto"/>
-              <w:rPr>
-                <w:rFonts w:ascii="BRH Devanagari Extra" w:hAnsi="BRH Devanagari Extra" w:cs="BRH Devanagari Extra"/>
-                <w:color w:val="000000"/>
-                <w:sz w:val="32"/>
-                <w:szCs w:val="40"/>
-                <w:lang w:val="it-IT"/>
+              <w:rPr>
+                <w:rFonts w:ascii="Latha" w:hAnsi="Latha" w:cs="Latha"/>
+                <w:szCs w:val="28"/>
+                <w:lang w:bidi="ta-IN"/>
               </w:rPr>
             </w:pPr>
             <w:r>
               <w:rPr>
-                <w:rFonts w:cs="BRH Devanagari Extra"/>
-                <w:color w:val="000000"/>
-                <w:szCs w:val="40"/>
-                <w:lang w:val="it-IT"/>
+                <w:rFonts w:cs="Latha"/>
+                <w:b/>
+                <w:bCs/>
+                <w:szCs w:val="28"/>
+                <w:cs/>
+                <w:lang w:bidi="ta-IN"/>
               </w:rPr>
               <w:t>5</w:t>
             </w:r>
             <w:r>
               <w:rPr>
-                <w:rFonts w:ascii="BRH Devanagari Extra" w:hAnsi="BRH Devanagari Extra" w:cs="BRH Devanagari Extra"/>
-                <w:color w:val="000000"/>
-                <w:sz w:val="32"/>
-                <w:szCs w:val="40"/>
-                <w:lang w:val="it-IT"/>
-              </w:rPr>
-              <w:t xml:space="preserve">)   </w:t>
-            </w:r>
-            <w:r>
-              <w:rPr>
-                <w:rFonts w:cs="BRH Devanagari Extra"/>
-                <w:color w:val="000000"/>
-                <w:szCs w:val="40"/>
-                <w:lang w:val="it-IT"/>
-              </w:rPr>
-              <w:t>1</w:t>
-            </w:r>
-            <w:r>
-              <w:rPr>
-                <w:rFonts w:ascii="BRH Devanagari Extra" w:hAnsi="BRH Devanagari Extra" w:cs="BRH Devanagari Extra"/>
-                <w:color w:val="000000"/>
-                <w:sz w:val="32"/>
-                <w:szCs w:val="40"/>
-                <w:lang w:val="it-IT"/>
-              </w:rPr>
-              <w:t>.</w:t>
-            </w:r>
-            <w:r>
-              <w:rPr>
-                <w:rFonts w:cs="BRH Devanagari Extra"/>
-                <w:color w:val="000000"/>
-                <w:szCs w:val="40"/>
-                <w:lang w:val="it-IT"/>
+                <w:rFonts w:cs="Latha"/>
+                <w:b/>
+                <w:bCs/>
+                <w:szCs w:val="28"/>
+                <w:lang w:bidi="ta-IN"/>
+              </w:rPr>
+              <w:t>)</w:t>
+            </w:r>
+            <w:r>
+              <w:rPr>
+                <w:rFonts w:ascii="Latha" w:hAnsi="Latha" w:cs="Latha"/>
+                <w:szCs w:val="28"/>
+                <w:lang w:bidi="ta-IN"/>
+              </w:rPr>
+              <w:t xml:space="preserve">    </w:t>
+            </w:r>
+            <w:r>
+              <w:rPr>
+                <w:rFonts w:cs="Latha"/>
+                <w:b/>
+                <w:bCs/>
+                <w:szCs w:val="28"/>
+                <w:cs/>
+                <w:lang w:bidi="ta-IN"/>
+              </w:rPr>
+              <w:t>1.3.</w:t>
+            </w:r>
+            <w:r>
+              <w:rPr>
+                <w:rFonts w:cs="Latha"/>
+                <w:b/>
+                <w:bCs/>
+                <w:szCs w:val="28"/>
+                <w:cs/>
+                <w:lang w:bidi="ta-IN"/>
+              </w:rPr>
+              <w:t>14</w:t>
+            </w:r>
+            <w:r>
+              <w:rPr>
+                <w:rFonts w:cs="Latha"/>
+                <w:b/>
+                <w:bCs/>
+                <w:szCs w:val="28"/>
+                <w:lang w:bidi="ta-IN"/>
+              </w:rPr>
+              <w:t>.4</w:t>
+            </w:r>
+            <w:r>
+              <w:rPr>
+                <w:rFonts w:cs="Latha"/>
+                <w:b/>
+                <w:bCs/>
+                <w:szCs w:val="28"/>
+                <w:lang w:bidi="ta-IN"/>
+              </w:rPr>
+              <w:t>(</w:t>
+            </w:r>
+            <w:r>
+              <w:rPr>
+                <w:rFonts w:cs="Latha"/>
+                <w:b/>
+                <w:bCs/>
+                <w:szCs w:val="28"/>
+                <w:cs/>
+                <w:lang w:bidi="ta-IN"/>
               </w:rPr>
               <w:t>3</w:t>
             </w:r>
             <w:r>
               <w:rPr>
-                <w:rFonts w:ascii="BRH Devanagari Extra" w:hAnsi="BRH Devanagari Extra" w:cs="BRH Devanagari Extra"/>
-                <w:color w:val="000000"/>
-                <w:sz w:val="32"/>
-                <w:szCs w:val="40"/>
-                <w:lang w:val="it-IT"/>
-              </w:rPr>
-              <w:t>.</w:t>
-            </w:r>
-            <w:r>
-              <w:rPr>
-                <w:rFonts w:cs="BRH Devanagari Extra"/>
-                <w:color w:val="000000"/>
-                <w:szCs w:val="40"/>
-                <w:lang w:val="it-IT"/>
-              </w:rPr>
-              <w:t>14</w:t>
-            </w:r>
-            <w:r>
-              <w:rPr>
-                <w:rFonts w:ascii="BRH Devanagari Extra" w:hAnsi="BRH Devanagari Extra" w:cs="BRH Devanagari Extra"/>
-                <w:color w:val="000000"/>
-                <w:sz w:val="32"/>
-                <w:szCs w:val="40"/>
-                <w:lang w:val="it-IT"/>
-              </w:rPr>
-              <w:t>.</w:t>
-            </w:r>
-            <w:r>
-              <w:rPr>
-                <w:rFonts w:cs="BRH Devanagari Extra"/>
-                <w:color w:val="000000"/>
-                <w:szCs w:val="40"/>
-                <w:lang w:val="it-IT"/>
-              </w:rPr>
-              <w:t>4</w:t>
-            </w:r>
-            <w:r>
-              <w:rPr>
-                <w:rFonts w:ascii="BRH Devanagari Extra" w:hAnsi="BRH Devanagari Extra" w:cs="BRH Devanagari Extra"/>
-                <w:color w:val="000000"/>
-                <w:sz w:val="32"/>
-                <w:szCs w:val="40"/>
-                <w:lang w:val="it-IT"/>
-              </w:rPr>
-              <w:t>(</w:t>
-            </w:r>
-            <w:r>
-              <w:rPr>
-                <w:rFonts w:cs="BRH Devanagari Extra"/>
-                <w:color w:val="000000"/>
-                <w:szCs w:val="40"/>
-                <w:lang w:val="it-IT"/>
-              </w:rPr>
-              <w:t>3</w:t>
-            </w:r>
-            <w:r>
-              <w:rPr>
-                <w:rFonts w:ascii="BRH Devanagari Extra" w:hAnsi="BRH Devanagari Extra" w:cs="BRH Devanagari Extra"/>
-                <w:color w:val="000000"/>
-                <w:sz w:val="32"/>
-                <w:szCs w:val="40"/>
-                <w:lang w:val="it-IT"/>
-              </w:rPr>
-              <w:t>)- U</w:t>
-            </w:r>
-            <w:r>
-              <w:rPr>
-                <w:rFonts w:ascii="BRH Malayalam Extra" w:hAnsi="BRH Malayalam Extra" w:cs="BRH Devanagari Extra"/>
-                <w:color w:val="000000"/>
-                <w:szCs w:val="40"/>
-                <w:lang w:val="it-IT"/>
-              </w:rPr>
-              <w:t>–</w:t>
-            </w:r>
-            <w:r>
-              <w:rPr>
-                <w:rFonts w:ascii="BRH Devanagari Extra" w:hAnsi="BRH Devanagari Extra" w:cs="BRH Devanagari Extra"/>
-                <w:color w:val="000000"/>
-                <w:sz w:val="32"/>
-                <w:szCs w:val="40"/>
-                <w:lang w:val="it-IT"/>
-              </w:rPr>
-              <w:t>ÌrÉqÉç ||</w:t>
+                <w:rFonts w:cs="Latha"/>
+                <w:b/>
+                <w:bCs/>
+                <w:szCs w:val="28"/>
+                <w:cs/>
+                <w:lang w:bidi="ta-IN"/>
+              </w:rPr>
+              <w:t>)</w:t>
+            </w:r>
+            <w:r>
+              <w:rPr>
+                <w:rFonts w:ascii="Latha" w:hAnsi="Latha" w:cs="Latha"/>
+                <w:szCs w:val="28"/>
+                <w:lang w:bidi="ta-IN"/>
+              </w:rPr>
+              <w:t xml:space="preserve">- </w:t>
+            </w:r>
+            <w:r>
+              <w:rPr>
+                <w:rFonts w:ascii="Latha" w:hAnsi="Latha" w:cs="Latha"/>
+                <w:szCs w:val="28"/>
+                <w:cs/>
+                <w:lang w:bidi="ta-IN"/>
+              </w:rPr>
+              <w:t>ர</w:t>
+            </w:r>
+            <w:r>
+              <w:rPr>
+                <w:rFonts w:ascii="BRH Tamil Tab Extra" w:hAnsi="BRH Tamil Tab Extra" w:cs="Latha"/>
+                <w:b/>
+                <w:bCs/>
+                <w:sz w:val="32"/>
+                <w:szCs w:val="28"/>
+                <w:lang w:bidi="ta-IN"/>
+              </w:rPr>
+              <w:t>…</w:t>
+            </w:r>
+            <w:r>
+              <w:rPr>
+                <w:rFonts w:ascii="Latha" w:hAnsi="Latha" w:cs="Latha"/>
+                <w:szCs w:val="28"/>
+                <w:cs/>
+                <w:lang w:bidi="ta-IN"/>
+              </w:rPr>
+              <w:t xml:space="preserve">யிம் </w:t>
+            </w:r>
+            <w:r>
+              <w:rPr>
+                <w:rFonts w:ascii="Latha" w:hAnsi="Latha" w:cs="Latha"/>
+                <w:szCs w:val="28"/>
+                <w:lang w:bidi="ta-IN"/>
+              </w:rPr>
+              <w:t>||</w:t>
             </w:r>
           </w:p>
           <w:p>
@@ -531,62 +1206,89 @@
             </w:pPr>
             <w:r>
               <w:rPr>
-                <w:rFonts w:ascii="BRH Devanagari Extra" w:hAnsi="BRH Devanagari Extra" w:cs="BRH Devanagari Extra"/>
-                <w:color w:val="000000"/>
-                <w:sz w:val="32"/>
-                <w:szCs w:val="40"/>
-                <w:lang w:val="it-IT"/>
-              </w:rPr>
-              <w:t>U</w:t>
-            </w:r>
-            <w:r>
-              <w:rPr>
-                <w:rFonts w:ascii="BRH Malayalam Extra" w:hAnsi="BRH Malayalam Extra" w:cs="BRH Devanagari Extra"/>
-                <w:color w:val="000000"/>
-                <w:szCs w:val="40"/>
-                <w:lang w:val="it-IT"/>
-              </w:rPr>
-              <w:t>–</w:t>
-            </w:r>
-            <w:r>
-              <w:rPr>
-                <w:rFonts w:ascii="BRH Devanagari Extra" w:hAnsi="BRH Devanagari Extra" w:cs="BRH Devanagari Extra"/>
-                <w:color w:val="000000"/>
-                <w:sz w:val="32"/>
-                <w:szCs w:val="40"/>
-                <w:lang w:val="it-IT"/>
-              </w:rPr>
-              <w:t xml:space="preserve">ÌrÉÍqÉÌiÉþ </w:t>
-            </w:r>
-            <w:r>
-              <w:rPr>
-                <w:rFonts w:ascii="BRH Devanagari Extra" w:hAnsi="BRH Devanagari Extra" w:cs="BRH Devanagari Extra"/>
-                <w:color w:val="000000"/>
-                <w:sz w:val="32"/>
-                <w:szCs w:val="40"/>
+                <w:rFonts w:ascii="Latha" w:hAnsi="Latha" w:cs="Latha"/>
+                <w:szCs w:val="28"/>
+                <w:cs/>
+                <w:lang w:bidi="ta-IN"/>
+              </w:rPr>
+              <w:t>ர</w:t>
+            </w:r>
+            <w:r>
+              <w:rPr>
+                <w:rFonts w:ascii="BRH Tamil Tab Extra" w:hAnsi="BRH Tamil Tab Extra" w:cs="Latha"/>
+                <w:b/>
+                <w:bCs/>
+                <w:sz w:val="32"/>
+                <w:szCs w:val="28"/>
+                <w:lang w:bidi="ta-IN"/>
+              </w:rPr>
+              <w:t>…</w:t>
+            </w:r>
+            <w:r>
+              <w:rPr>
+                <w:rFonts w:ascii="Latha" w:hAnsi="Latha" w:cs="Latha"/>
+                <w:szCs w:val="28"/>
+                <w:cs/>
+                <w:lang w:bidi="ta-IN"/>
+              </w:rPr>
+              <w:t>யிமிதி</w:t>
+            </w:r>
+            <w:r>
+              <w:rPr>
+                <w:rFonts w:ascii="BRH Tamil Tab Extra" w:hAnsi="BRH Tamil Tab Extra" w:cs="Latha"/>
+                <w:b/>
+                <w:bCs/>
+                <w:sz w:val="32"/>
+                <w:szCs w:val="28"/>
+                <w:lang w:bidi="ta-IN"/>
+              </w:rPr>
+              <w:t>†</w:t>
+            </w:r>
+            <w:r>
+              <w:rPr>
+                <w:rFonts w:ascii="Latha" w:hAnsi="Latha" w:cs="Latha"/>
+                <w:szCs w:val="28"/>
+                <w:lang w:bidi="ta-IN"/>
+              </w:rPr>
+              <w:t xml:space="preserve"> </w:t>
+            </w:r>
+            <w:r>
+              <w:rPr>
+                <w:rFonts w:ascii="Latha" w:hAnsi="Latha" w:cs="Latha"/>
+                <w:szCs w:val="28"/>
                 <w:highlight w:val="green"/>
-                <w:lang w:val="it-IT"/>
-              </w:rPr>
-              <w:t>UÌ</w:t>
-            </w:r>
-            <w:r>
-              <w:rPr>
-                <w:rFonts w:ascii="BRH Malayalam Extra" w:hAnsi="BRH Malayalam Extra" w:cs="BRH Devanagari Extra"/>
-                <w:color w:val="000000"/>
-                <w:szCs w:val="40"/>
-                <w:lang w:val="it-IT"/>
-              </w:rPr>
-              <w:t>–</w:t>
-            </w:r>
-            <w:r>
-              <w:rPr>
-                <w:rFonts w:ascii="BRH Devanagari Extra" w:hAnsi="BRH Devanagari Extra" w:cs="BRH Devanagari Extra"/>
-                <w:color w:val="000000"/>
-                <w:sz w:val="32"/>
-                <w:szCs w:val="40"/>
-                <w:lang w:val="it-IT"/>
-              </w:rPr>
-              <w:t xml:space="preserve">rÉqÉç | </w:t>
+                <w:cs/>
+                <w:lang w:bidi="ta-IN"/>
+              </w:rPr>
+              <w:t>ர</w:t>
+            </w:r>
+            <w:r>
+              <w:rPr>
+                <w:rFonts w:ascii="BRH Tamil Tab Extra" w:hAnsi="BRH Tamil Tab Extra" w:cs="Latha"/>
+                <w:b/>
+                <w:bCs/>
+                <w:sz w:val="32"/>
+                <w:szCs w:val="28"/>
+                <w:lang w:bidi="ta-IN"/>
+              </w:rPr>
+              <w:t>…</w:t>
+            </w:r>
+            <w:r>
+              <w:rPr>
+                <w:rFonts w:ascii="Latha" w:hAnsi="Latha" w:cs="Latha"/>
+                <w:szCs w:val="28"/>
+                <w:cs/>
+                <w:lang w:bidi="ta-IN"/>
+              </w:rPr>
+              <w:t xml:space="preserve">யிம் </w:t>
+            </w:r>
+            <w:r>
+              <w:rPr>
+                <w:rFonts w:ascii="Latha" w:hAnsi="Latha" w:cs="Latha"/>
+                <w:szCs w:val="28"/>
+                <w:lang w:bidi="ta-IN"/>
+              </w:rPr>
+              <w:t>|</w:t>
             </w:r>
           </w:p>
         </w:tc>
@@ -1607,6 +2309,7 @@
                 <w:cs/>
                 <w:lang w:bidi="ta-IN"/>
               </w:rPr>
+              <w:lastRenderedPageBreak/>
               <w:t>38</w:t>
             </w:r>
             <w:r>
@@ -2046,7 +2749,6 @@
                 <w:cs/>
                 <w:lang w:bidi="ta-IN"/>
               </w:rPr>
-              <w:lastRenderedPageBreak/>
               <w:t>வலக</w:t>
             </w:r>
             <w:r>
@@ -3136,6 +3838,7 @@
                 <w:cs/>
                 <w:lang w:bidi="ta-IN"/>
               </w:rPr>
+              <w:lastRenderedPageBreak/>
               <w:t>ரக்ஷோ</w:t>
             </w:r>
             <w:r>
@@ -3718,7 +4421,6 @@
                 <w:cs/>
                 <w:lang w:bidi="ta-IN"/>
               </w:rPr>
-              <w:lastRenderedPageBreak/>
               <w:t>வலக</w:t>
             </w:r>
             <w:r>
@@ -6248,7 +6950,17 @@
                 <w:cs/>
                 <w:lang w:bidi="ta-IN"/>
               </w:rPr>
-              <w:t>யம் ஜர்</w:t>
+              <w:t xml:space="preserve">யம் </w:t>
+            </w:r>
+            <w:r>
+              <w:rPr>
+                <w:rFonts w:ascii="Latha" w:hAnsi="Latha" w:cs="Latha"/>
+                <w:szCs w:val="28"/>
+                <w:cs/>
+                <w:lang w:bidi="ta-IN"/>
+              </w:rPr>
+              <w:lastRenderedPageBreak/>
+              <w:t>ஜர்</w:t>
             </w:r>
             <w:r>
               <w:rPr>
@@ -6455,6 +7167,7 @@
                 <w:cs/>
                 <w:lang w:bidi="ta-IN"/>
               </w:rPr>
+              <w:lastRenderedPageBreak/>
               <w:t>32</w:t>
             </w:r>
             <w:r>
@@ -6909,6 +7622,7 @@
                 <w:cs/>
                 <w:lang w:bidi="ta-IN"/>
               </w:rPr>
+              <w:lastRenderedPageBreak/>
               <w:t>ஜர்</w:t>
             </w:r>
             <w:r>
@@ -7041,6 +7755,7 @@
                 <w:cs/>
                 <w:lang w:bidi="ta-IN"/>
               </w:rPr>
+              <w:lastRenderedPageBreak/>
               <w:t>42</w:t>
             </w:r>
             <w:r>
@@ -7347,7 +8062,6 @@
                 <w:cs/>
                 <w:lang w:bidi="ta-IN"/>
               </w:rPr>
-              <w:lastRenderedPageBreak/>
               <w:t>போஷே</w:t>
             </w:r>
             <w:r>
@@ -7618,7 +8332,6 @@
                 <w:cs/>
                 <w:lang w:bidi="ta-IN"/>
               </w:rPr>
-              <w:lastRenderedPageBreak/>
               <w:t>42</w:t>
             </w:r>
             <w:r>
@@ -7925,7 +8638,6 @@
                 <w:cs/>
                 <w:lang w:bidi="ta-IN"/>
               </w:rPr>
-              <w:lastRenderedPageBreak/>
               <w:t>போஷே</w:t>
             </w:r>
             <w:r>
@@ -8223,7 +8935,6 @@
                 <w:cs/>
                 <w:lang w:bidi="ta-IN"/>
               </w:rPr>
-              <w:lastRenderedPageBreak/>
               <w:t>14)</w:t>
             </w:r>
             <w:r>
@@ -10606,6 +11317,7 @@
                 <w:cs/>
                 <w:lang w:bidi="ta-IN"/>
               </w:rPr>
+              <w:lastRenderedPageBreak/>
               <w:t>அ</w:t>
             </w:r>
             <w:r>
@@ -10953,6 +11665,7 @@
                 <w:cs/>
                 <w:lang w:bidi="ta-IN"/>
               </w:rPr>
+              <w:lastRenderedPageBreak/>
               <w:t>26</w:t>
             </w:r>
             <w:r>
@@ -11206,329 +11919,345 @@
               <w:adjustRightInd w:val="0"/>
               <w:spacing w:before="0" w:line="240" w:lineRule="auto"/>
               <w:rPr>
-                <w:rFonts w:cs="Latha"/>
-                <w:b/>
-                <w:bCs/>
-                <w:szCs w:val="28"/>
-                <w:cs/>
-                <w:lang w:bidi="ta-IN"/>
-              </w:rPr>
-            </w:pPr>
-            <w:r>
-              <w:rPr>
-                <w:rFonts w:ascii="Latha" w:hAnsi="Latha" w:cs="Latha"/>
-                <w:szCs w:val="28"/>
-                <w:cs/>
-                <w:lang w:bidi="ta-IN"/>
-              </w:rPr>
-              <w:t>அ</w:t>
-            </w:r>
-            <w:r>
-              <w:rPr>
-                <w:rFonts w:ascii="BRH Tamil Tab Extra" w:hAnsi="BRH Tamil Tab Extra" w:cs="Latha"/>
-                <w:b/>
-                <w:bCs/>
-                <w:szCs w:val="28"/>
-                <w:lang w:bidi="ta-IN"/>
-              </w:rPr>
-              <w:t>…</w:t>
-            </w:r>
-            <w:r>
-              <w:rPr>
-                <w:rFonts w:ascii="Latha" w:hAnsi="Latha" w:cs="Latha"/>
-                <w:szCs w:val="28"/>
-                <w:cs/>
-                <w:lang w:bidi="ta-IN"/>
-              </w:rPr>
-              <w:t>தி</w:t>
-            </w:r>
-            <w:r>
-              <w:rPr>
-                <w:rFonts w:ascii="BRH Tamil Tab Extra" w:hAnsi="BRH Tamil Tab Extra" w:cs="Latha"/>
-                <w:b/>
-                <w:bCs/>
-                <w:szCs w:val="28"/>
-                <w:lang w:bidi="ta-IN"/>
-              </w:rPr>
-              <w:t>…</w:t>
-            </w:r>
-            <w:r>
-              <w:rPr>
-                <w:rFonts w:ascii="Latha" w:hAnsi="Latha" w:cs="Latha"/>
-                <w:b/>
-                <w:bCs/>
-                <w:position w:val="-12"/>
-                <w:szCs w:val="28"/>
-                <w:cs/>
-                <w:lang w:bidi="ta-IN"/>
-              </w:rPr>
-              <w:t>4</w:t>
-            </w:r>
-            <w:r>
-              <w:rPr>
-                <w:rFonts w:ascii="Latha" w:hAnsi="Latha" w:cs="Latha"/>
-                <w:szCs w:val="28"/>
-                <w:cs/>
-                <w:lang w:bidi="ta-IN"/>
-              </w:rPr>
-              <w:t>ரா</w:t>
-            </w:r>
-            <w:r>
-              <w:rPr>
-                <w:rFonts w:ascii="BRH Tamil Tab Extra" w:hAnsi="BRH Tamil Tab Extra" w:cs="Latha"/>
-                <w:b/>
-                <w:bCs/>
-                <w:szCs w:val="28"/>
-                <w:lang w:bidi="ta-IN"/>
-              </w:rPr>
-              <w:t>…</w:t>
-            </w:r>
-            <w:r>
-              <w:rPr>
-                <w:rFonts w:ascii="Latha" w:hAnsi="Latha" w:cs="Latha"/>
-                <w:szCs w:val="28"/>
-                <w:cs/>
-                <w:lang w:bidi="ta-IN"/>
-              </w:rPr>
-              <w:t>ஜ ஏ</w:t>
-            </w:r>
-            <w:r>
-              <w:rPr>
-                <w:rFonts w:ascii="BRH Tamil Tab Extra" w:hAnsi="BRH Tamil Tab Extra" w:cs="Latha"/>
-                <w:b/>
-                <w:bCs/>
-                <w:szCs w:val="28"/>
-                <w:lang w:bidi="ta-IN"/>
-              </w:rPr>
-              <w:t>…</w:t>
-            </w:r>
-            <w:r>
-              <w:rPr>
-                <w:rFonts w:ascii="Latha" w:hAnsi="Latha" w:cs="Latha"/>
-                <w:szCs w:val="28"/>
-                <w:cs/>
-                <w:lang w:bidi="ta-IN"/>
-              </w:rPr>
-              <w:t>ஷ ஏ</w:t>
-            </w:r>
-            <w:r>
-              <w:rPr>
-                <w:rFonts w:ascii="BRH Tamil Tab Extra" w:hAnsi="BRH Tamil Tab Extra" w:cs="Latha"/>
-                <w:b/>
-                <w:bCs/>
-                <w:szCs w:val="28"/>
-                <w:highlight w:val="green"/>
-                <w:lang w:bidi="ta-IN"/>
-              </w:rPr>
-              <w:t>…</w:t>
-            </w:r>
-            <w:r>
-              <w:rPr>
-                <w:rFonts w:ascii="Latha" w:hAnsi="Latha" w:cs="Latha"/>
-                <w:szCs w:val="28"/>
-                <w:highlight w:val="green"/>
-                <w:cs/>
-                <w:lang w:bidi="ta-IN"/>
-              </w:rPr>
-              <w:t>ஷோ</w:t>
-            </w:r>
-            <w:r>
-              <w:rPr>
-                <w:rFonts w:ascii="BRH Tamil Tab Extra" w:hAnsi="BRH Tamil Tab Extra" w:cs="Latha"/>
-                <w:b/>
-                <w:bCs/>
-                <w:sz w:val="28"/>
-                <w:szCs w:val="28"/>
-                <w:lang w:bidi="ta-IN"/>
-              </w:rPr>
-              <w:t>†</w:t>
-            </w:r>
-            <w:r>
-              <w:rPr>
-                <w:rFonts w:ascii="Latha" w:hAnsi="Latha" w:cs="Latha"/>
-                <w:szCs w:val="28"/>
-                <w:cs/>
-                <w:lang w:bidi="ta-IN"/>
-              </w:rPr>
-              <w:t xml:space="preserve"> </w:t>
-            </w:r>
-            <w:r>
-              <w:rPr>
-                <w:rFonts w:ascii="BRH Devanagari Extra" w:hAnsi="BRH Devanagari Extra" w:cs="Latha"/>
-                <w:b/>
-                <w:bCs/>
-                <w:sz w:val="32"/>
-                <w:szCs w:val="28"/>
-                <w:lang w:bidi="ta-IN"/>
-              </w:rPr>
-              <w:t>Å</w:t>
-            </w:r>
-            <w:r>
-              <w:rPr>
-                <w:rFonts w:ascii="Latha" w:hAnsi="Latha" w:cs="Latha"/>
-                <w:szCs w:val="28"/>
-                <w:cs/>
-                <w:lang w:bidi="ta-IN"/>
-              </w:rPr>
-              <w:t>தி</w:t>
-            </w:r>
-            <w:r>
-              <w:rPr>
-                <w:rFonts w:ascii="Latha" w:hAnsi="Latha" w:cs="Latha"/>
-                <w:b/>
-                <w:bCs/>
-                <w:position w:val="-12"/>
-                <w:szCs w:val="28"/>
-                <w:cs/>
-                <w:lang w:bidi="ta-IN"/>
-              </w:rPr>
-              <w:t>4</w:t>
-            </w:r>
-            <w:r>
-              <w:rPr>
-                <w:rFonts w:ascii="Latha" w:hAnsi="Latha" w:cs="Latha"/>
-                <w:szCs w:val="28"/>
-                <w:cs/>
-                <w:lang w:bidi="ta-IN"/>
-              </w:rPr>
-              <w:t>ரா</w:t>
-            </w:r>
-            <w:r>
-              <w:rPr>
-                <w:rFonts w:ascii="BRH Tamil Tab Extra" w:hAnsi="BRH Tamil Tab Extra" w:cs="Latha"/>
-                <w:b/>
-                <w:bCs/>
-                <w:szCs w:val="28"/>
-                <w:lang w:bidi="ta-IN"/>
-              </w:rPr>
-              <w:t>…</w:t>
-            </w:r>
-            <w:r>
-              <w:rPr>
-                <w:rFonts w:ascii="Latha" w:hAnsi="Latha" w:cs="Latha"/>
-                <w:szCs w:val="28"/>
-                <w:cs/>
-                <w:lang w:bidi="ta-IN"/>
-              </w:rPr>
-              <w:t>ஜோ</w:t>
-            </w:r>
-            <w:r>
-              <w:rPr>
-                <w:rFonts w:ascii="BRH Tamil Tab Extra" w:hAnsi="BRH Tamil Tab Extra" w:cs="Latha"/>
-                <w:b/>
-                <w:bCs/>
-                <w:szCs w:val="28"/>
-                <w:lang w:bidi="ta-IN"/>
-              </w:rPr>
-              <w:t>†</w:t>
-            </w:r>
-            <w:r>
-              <w:rPr>
-                <w:rFonts w:ascii="Latha" w:hAnsi="Latha" w:cs="Latha"/>
-                <w:szCs w:val="28"/>
-                <w:lang w:bidi="ta-IN"/>
-              </w:rPr>
-              <w:t xml:space="preserve"> </w:t>
-            </w:r>
-            <w:r>
-              <w:rPr>
-                <w:rFonts w:ascii="BRH Devanagari Extra" w:hAnsi="BRH Devanagari Extra" w:cs="Latha"/>
-                <w:b/>
-                <w:bCs/>
-                <w:sz w:val="32"/>
-                <w:szCs w:val="28"/>
-                <w:lang w:bidi="ta-IN"/>
-              </w:rPr>
-              <w:t>Å</w:t>
-            </w:r>
-            <w:r>
-              <w:rPr>
-                <w:rFonts w:ascii="Latha" w:hAnsi="Latha" w:cs="Latha"/>
-                <w:szCs w:val="28"/>
-                <w:cs/>
-                <w:lang w:bidi="ta-IN"/>
-              </w:rPr>
-              <w:t>தி</w:t>
-            </w:r>
-            <w:r>
-              <w:rPr>
-                <w:rFonts w:ascii="Latha" w:hAnsi="Latha" w:cs="Latha"/>
-                <w:b/>
-                <w:bCs/>
-                <w:position w:val="-12"/>
-                <w:szCs w:val="28"/>
-                <w:cs/>
-                <w:lang w:bidi="ta-IN"/>
-              </w:rPr>
-              <w:t>4</w:t>
-            </w:r>
-            <w:r>
-              <w:rPr>
-                <w:rFonts w:ascii="Latha" w:hAnsi="Latha" w:cs="Latha"/>
-                <w:szCs w:val="28"/>
-                <w:cs/>
-                <w:lang w:bidi="ta-IN"/>
-              </w:rPr>
-              <w:t>ரா</w:t>
-            </w:r>
-            <w:r>
-              <w:rPr>
-                <w:rFonts w:ascii="BRH Tamil Tab Extra" w:hAnsi="BRH Tamil Tab Extra" w:cs="Latha"/>
-                <w:b/>
-                <w:bCs/>
-                <w:szCs w:val="28"/>
-                <w:lang w:bidi="ta-IN"/>
-              </w:rPr>
-              <w:t>…</w:t>
-            </w:r>
-            <w:r>
-              <w:rPr>
-                <w:rFonts w:ascii="Latha" w:hAnsi="Latha" w:cs="Latha"/>
-                <w:szCs w:val="28"/>
-                <w:cs/>
-                <w:lang w:bidi="ta-IN"/>
-              </w:rPr>
-              <w:t>ஜ ஏ</w:t>
-            </w:r>
-            <w:r>
-              <w:rPr>
-                <w:rFonts w:ascii="BRH Tamil Tab Extra" w:hAnsi="BRH Tamil Tab Extra" w:cs="Latha"/>
-                <w:b/>
-                <w:bCs/>
-                <w:szCs w:val="28"/>
-                <w:lang w:bidi="ta-IN"/>
-              </w:rPr>
-              <w:t>…</w:t>
-            </w:r>
-            <w:r>
-              <w:rPr>
-                <w:rFonts w:ascii="Latha" w:hAnsi="Latha" w:cs="Latha"/>
-                <w:szCs w:val="28"/>
-                <w:cs/>
-                <w:lang w:bidi="ta-IN"/>
-              </w:rPr>
-              <w:t>ஷ</w:t>
-            </w:r>
-            <w:r>
-              <w:rPr>
-                <w:rFonts w:ascii="Latha" w:hAnsi="Latha" w:cs="Latha"/>
-                <w:b/>
-                <w:bCs/>
-                <w:szCs w:val="28"/>
-                <w:cs/>
-                <w:lang w:bidi="ta-IN"/>
-              </w:rPr>
-              <w:t>:</w:t>
-            </w:r>
-            <w:r>
-              <w:rPr>
                 <w:rFonts w:ascii="BRH Devanagari Extra" w:hAnsi="BRH Devanagari Extra" w:cs="BRH Devanagari Extra"/>
                 <w:color w:val="000000"/>
                 <w:sz w:val="32"/>
                 <w:szCs w:val="40"/>
               </w:rPr>
+            </w:pPr>
+            <w:r>
+              <w:rPr>
+                <w:rFonts w:ascii="Latha" w:hAnsi="Latha" w:cs="Latha"/>
+                <w:szCs w:val="28"/>
+                <w:cs/>
+                <w:lang w:bidi="ta-IN"/>
+              </w:rPr>
+              <w:lastRenderedPageBreak/>
+              <w:t>அ</w:t>
+            </w:r>
+            <w:r>
+              <w:rPr>
+                <w:rFonts w:ascii="BRH Tamil Tab Extra" w:hAnsi="BRH Tamil Tab Extra" w:cs="Latha"/>
+                <w:b/>
+                <w:bCs/>
+                <w:szCs w:val="28"/>
+                <w:lang w:bidi="ta-IN"/>
+              </w:rPr>
+              <w:t>…</w:t>
+            </w:r>
+            <w:r>
+              <w:rPr>
+                <w:rFonts w:ascii="Latha" w:hAnsi="Latha" w:cs="Latha"/>
+                <w:szCs w:val="28"/>
+                <w:cs/>
+                <w:lang w:bidi="ta-IN"/>
+              </w:rPr>
+              <w:t>தி</w:t>
+            </w:r>
+            <w:r>
+              <w:rPr>
+                <w:rFonts w:ascii="BRH Tamil Tab Extra" w:hAnsi="BRH Tamil Tab Extra" w:cs="Latha"/>
+                <w:b/>
+                <w:bCs/>
+                <w:szCs w:val="28"/>
+                <w:lang w:bidi="ta-IN"/>
+              </w:rPr>
+              <w:t>…</w:t>
+            </w:r>
+            <w:r>
+              <w:rPr>
+                <w:rFonts w:ascii="Latha" w:hAnsi="Latha" w:cs="Latha"/>
+                <w:b/>
+                <w:bCs/>
+                <w:position w:val="-12"/>
+                <w:szCs w:val="28"/>
+                <w:cs/>
+                <w:lang w:bidi="ta-IN"/>
+              </w:rPr>
+              <w:t>4</w:t>
+            </w:r>
+            <w:r>
+              <w:rPr>
+                <w:rFonts w:ascii="Latha" w:hAnsi="Latha" w:cs="Latha"/>
+                <w:szCs w:val="28"/>
+                <w:cs/>
+                <w:lang w:bidi="ta-IN"/>
+              </w:rPr>
+              <w:t>ரா</w:t>
+            </w:r>
+            <w:r>
+              <w:rPr>
+                <w:rFonts w:ascii="BRH Tamil Tab Extra" w:hAnsi="BRH Tamil Tab Extra" w:cs="Latha"/>
+                <w:b/>
+                <w:bCs/>
+                <w:szCs w:val="28"/>
+                <w:lang w:bidi="ta-IN"/>
+              </w:rPr>
+              <w:t>…</w:t>
+            </w:r>
+            <w:r>
+              <w:rPr>
+                <w:rFonts w:ascii="Latha" w:hAnsi="Latha" w:cs="Latha"/>
+                <w:szCs w:val="28"/>
+                <w:cs/>
+                <w:lang w:bidi="ta-IN"/>
+              </w:rPr>
+              <w:t>ஜ ஏ</w:t>
+            </w:r>
+            <w:r>
+              <w:rPr>
+                <w:rFonts w:ascii="BRH Tamil Tab Extra" w:hAnsi="BRH Tamil Tab Extra" w:cs="Latha"/>
+                <w:b/>
+                <w:bCs/>
+                <w:szCs w:val="28"/>
+                <w:lang w:bidi="ta-IN"/>
+              </w:rPr>
+              <w:t>…</w:t>
+            </w:r>
+            <w:r>
+              <w:rPr>
+                <w:rFonts w:ascii="Latha" w:hAnsi="Latha" w:cs="Latha"/>
+                <w:szCs w:val="28"/>
+                <w:cs/>
+                <w:lang w:bidi="ta-IN"/>
+              </w:rPr>
+              <w:t>ஷ ஏ</w:t>
+            </w:r>
+            <w:r>
+              <w:rPr>
+                <w:rFonts w:ascii="BRH Tamil Tab Extra" w:hAnsi="BRH Tamil Tab Extra" w:cs="Latha"/>
+                <w:b/>
+                <w:bCs/>
+                <w:szCs w:val="28"/>
+                <w:highlight w:val="green"/>
+                <w:lang w:bidi="ta-IN"/>
+              </w:rPr>
+              <w:t>…</w:t>
+            </w:r>
+            <w:r>
+              <w:rPr>
+                <w:rFonts w:ascii="Latha" w:hAnsi="Latha" w:cs="Latha"/>
+                <w:szCs w:val="28"/>
+                <w:highlight w:val="green"/>
+                <w:cs/>
+                <w:lang w:bidi="ta-IN"/>
+              </w:rPr>
+              <w:t>ஷோ</w:t>
+            </w:r>
+            <w:r>
+              <w:rPr>
+                <w:rFonts w:ascii="BRH Tamil Tab Extra" w:hAnsi="BRH Tamil Tab Extra" w:cs="Latha"/>
+                <w:b/>
+                <w:bCs/>
+                <w:sz w:val="28"/>
+                <w:szCs w:val="28"/>
+                <w:lang w:bidi="ta-IN"/>
+              </w:rPr>
+              <w:t>†</w:t>
+            </w:r>
+            <w:r>
+              <w:rPr>
+                <w:rFonts w:ascii="Latha" w:hAnsi="Latha" w:cs="Latha"/>
+                <w:szCs w:val="28"/>
+                <w:cs/>
+                <w:lang w:bidi="ta-IN"/>
+              </w:rPr>
               <w:t xml:space="preserve"> </w:t>
             </w:r>
+            <w:r>
+              <w:rPr>
+                <w:rFonts w:ascii="BRH Devanagari Extra" w:hAnsi="BRH Devanagari Extra" w:cs="Latha"/>
+                <w:b/>
+                <w:bCs/>
+                <w:sz w:val="32"/>
+                <w:szCs w:val="28"/>
+                <w:lang w:bidi="ta-IN"/>
+              </w:rPr>
+              <w:t>Å</w:t>
+            </w:r>
+            <w:r>
+              <w:rPr>
+                <w:rFonts w:ascii="Latha" w:hAnsi="Latha" w:cs="Latha"/>
+                <w:szCs w:val="28"/>
+                <w:cs/>
+                <w:lang w:bidi="ta-IN"/>
+              </w:rPr>
+              <w:t>தி</w:t>
+            </w:r>
+            <w:r>
+              <w:rPr>
+                <w:rFonts w:ascii="Latha" w:hAnsi="Latha" w:cs="Latha"/>
+                <w:b/>
+                <w:bCs/>
+                <w:position w:val="-12"/>
+                <w:szCs w:val="28"/>
+                <w:cs/>
+                <w:lang w:bidi="ta-IN"/>
+              </w:rPr>
+              <w:t>4</w:t>
+            </w:r>
+            <w:r>
+              <w:rPr>
+                <w:rFonts w:ascii="Latha" w:hAnsi="Latha" w:cs="Latha"/>
+                <w:szCs w:val="28"/>
+                <w:cs/>
+                <w:lang w:bidi="ta-IN"/>
+              </w:rPr>
+              <w:t>ரா</w:t>
+            </w:r>
+            <w:r>
+              <w:rPr>
+                <w:rFonts w:ascii="BRH Tamil Tab Extra" w:hAnsi="BRH Tamil Tab Extra" w:cs="Latha"/>
+                <w:b/>
+                <w:bCs/>
+                <w:szCs w:val="28"/>
+                <w:lang w:bidi="ta-IN"/>
+              </w:rPr>
+              <w:t>…</w:t>
+            </w:r>
+            <w:r>
+              <w:rPr>
+                <w:rFonts w:ascii="Latha" w:hAnsi="Latha" w:cs="Latha"/>
+                <w:szCs w:val="28"/>
+                <w:cs/>
+                <w:lang w:bidi="ta-IN"/>
+              </w:rPr>
+              <w:t>ஜோ</w:t>
+            </w:r>
+            <w:r>
+              <w:rPr>
+                <w:rFonts w:ascii="BRH Tamil Tab Extra" w:hAnsi="BRH Tamil Tab Extra" w:cs="Latha"/>
+                <w:b/>
+                <w:bCs/>
+                <w:szCs w:val="28"/>
+                <w:lang w:bidi="ta-IN"/>
+              </w:rPr>
+              <w:t>†</w:t>
+            </w:r>
+            <w:r>
+              <w:rPr>
+                <w:rFonts w:ascii="Latha" w:hAnsi="Latha" w:cs="Latha"/>
+                <w:szCs w:val="28"/>
+                <w:lang w:bidi="ta-IN"/>
+              </w:rPr>
+              <w:t xml:space="preserve"> </w:t>
+            </w:r>
+            <w:r>
+              <w:rPr>
+                <w:rFonts w:ascii="BRH Devanagari Extra" w:hAnsi="BRH Devanagari Extra" w:cs="Latha"/>
+                <w:b/>
+                <w:bCs/>
+                <w:sz w:val="32"/>
+                <w:szCs w:val="28"/>
+                <w:lang w:bidi="ta-IN"/>
+              </w:rPr>
+              <w:t>Å</w:t>
+            </w:r>
+            <w:r>
+              <w:rPr>
+                <w:rFonts w:ascii="Latha" w:hAnsi="Latha" w:cs="Latha"/>
+                <w:szCs w:val="28"/>
+                <w:cs/>
+                <w:lang w:bidi="ta-IN"/>
+              </w:rPr>
+              <w:t>தி</w:t>
+            </w:r>
+            <w:r>
+              <w:rPr>
+                <w:rFonts w:ascii="Latha" w:hAnsi="Latha" w:cs="Latha"/>
+                <w:b/>
+                <w:bCs/>
+                <w:position w:val="-12"/>
+                <w:szCs w:val="28"/>
+                <w:cs/>
+                <w:lang w:bidi="ta-IN"/>
+              </w:rPr>
+              <w:t>4</w:t>
+            </w:r>
+            <w:r>
+              <w:rPr>
+                <w:rFonts w:ascii="Latha" w:hAnsi="Latha" w:cs="Latha"/>
+                <w:szCs w:val="28"/>
+                <w:cs/>
+                <w:lang w:bidi="ta-IN"/>
+              </w:rPr>
+              <w:t>ரா</w:t>
+            </w:r>
+            <w:r>
+              <w:rPr>
+                <w:rFonts w:ascii="BRH Tamil Tab Extra" w:hAnsi="BRH Tamil Tab Extra" w:cs="Latha"/>
+                <w:b/>
+                <w:bCs/>
+                <w:szCs w:val="28"/>
+                <w:lang w:bidi="ta-IN"/>
+              </w:rPr>
+              <w:t>…</w:t>
+            </w:r>
+            <w:r>
+              <w:rPr>
+                <w:rFonts w:ascii="Latha" w:hAnsi="Latha" w:cs="Latha"/>
+                <w:szCs w:val="28"/>
+                <w:cs/>
+                <w:lang w:bidi="ta-IN"/>
+              </w:rPr>
+              <w:t>ஜ ஏ</w:t>
+            </w:r>
+            <w:r>
+              <w:rPr>
+                <w:rFonts w:ascii="BRH Tamil Tab Extra" w:hAnsi="BRH Tamil Tab Extra" w:cs="Latha"/>
+                <w:b/>
+                <w:bCs/>
+                <w:szCs w:val="28"/>
+                <w:lang w:bidi="ta-IN"/>
+              </w:rPr>
+              <w:t>…</w:t>
+            </w:r>
+            <w:r>
+              <w:rPr>
+                <w:rFonts w:ascii="Latha" w:hAnsi="Latha" w:cs="Latha"/>
+                <w:szCs w:val="28"/>
+                <w:cs/>
+                <w:lang w:bidi="ta-IN"/>
+              </w:rPr>
+              <w:t>ஷ</w:t>
+            </w:r>
+            <w:r>
+              <w:rPr>
+                <w:rFonts w:ascii="Latha" w:hAnsi="Latha" w:cs="Latha"/>
+                <w:b/>
+                <w:bCs/>
+                <w:szCs w:val="28"/>
+                <w:cs/>
+                <w:lang w:bidi="ta-IN"/>
+              </w:rPr>
+              <w:t>:</w:t>
+            </w:r>
+            <w:r>
+              <w:rPr>
+                <w:rFonts w:ascii="BRH Devanagari Extra" w:hAnsi="BRH Devanagari Extra" w:cs="BRH Devanagari Extra"/>
+                <w:color w:val="000000"/>
+                <w:sz w:val="32"/>
+                <w:szCs w:val="40"/>
+              </w:rPr>
+              <w:t xml:space="preserve"> </w:t>
+            </w:r>
+          </w:p>
+          <w:p>
+            <w:pPr>
+              <w:widowControl w:val="0"/>
+              <w:autoSpaceDE w:val="0"/>
+              <w:autoSpaceDN w:val="0"/>
+              <w:adjustRightInd w:val="0"/>
+              <w:spacing w:before="0" w:line="240" w:lineRule="auto"/>
+              <w:rPr>
+                <w:rFonts w:cs="Latha"/>
+                <w:b/>
+                <w:bCs/>
+                <w:szCs w:val="28"/>
+                <w:cs/>
+                <w:lang w:bidi="ta-IN"/>
+              </w:rPr>
+            </w:pPr>
           </w:p>
         </w:tc>
       </w:tr>
@@ -11555,6 +12284,7 @@
                 <w:cs/>
                 <w:lang w:bidi="ta-IN"/>
               </w:rPr>
+              <w:lastRenderedPageBreak/>
               <w:t>24</w:t>
             </w:r>
             <w:r>
@@ -11740,7 +12470,6 @@
                 <w:cs/>
                 <w:lang w:bidi="ta-IN"/>
               </w:rPr>
-              <w:lastRenderedPageBreak/>
               <w:t>25</w:t>
             </w:r>
             <w:r>
@@ -12474,7 +13203,6 @@
                 <w:cs/>
                 <w:lang w:bidi="ta-IN"/>
               </w:rPr>
-              <w:lastRenderedPageBreak/>
               <w:t>24</w:t>
             </w:r>
             <w:r>
@@ -12652,7 +13380,6 @@
                 <w:cs/>
                 <w:lang w:bidi="ta-IN"/>
               </w:rPr>
-              <w:lastRenderedPageBreak/>
               <w:t>25</w:t>
             </w:r>
             <w:r>
@@ -13475,7 +14202,6 @@
                 <w:cs/>
                 <w:lang w:bidi="ta-IN"/>
               </w:rPr>
-              <w:lastRenderedPageBreak/>
               <w:t>43</w:t>
             </w:r>
             <w:r>
@@ -15066,6 +15792,7 @@
                 <w:cs/>
                 <w:lang w:bidi="ta-IN"/>
               </w:rPr>
+              <w:lastRenderedPageBreak/>
               <w:t>ப்ரி</w:t>
             </w:r>
             <w:r>
@@ -15415,6 +16142,7 @@
                 <w:cs/>
                 <w:lang w:bidi="ta-IN"/>
               </w:rPr>
+              <w:lastRenderedPageBreak/>
               <w:t>5</w:t>
             </w:r>
             <w:r>
@@ -15828,6 +16556,7 @@
                 <w:cs/>
                 <w:lang w:bidi="ta-IN"/>
               </w:rPr>
+              <w:lastRenderedPageBreak/>
               <w:t>ப்ரி</w:t>
             </w:r>
             <w:r>
@@ -16177,6 +16906,7 @@
                 <w:cs/>
                 <w:lang w:bidi="ta-IN"/>
               </w:rPr>
+              <w:lastRenderedPageBreak/>
               <w:t>20</w:t>
             </w:r>
             <w:r>
@@ -16592,7 +17322,6 @@
                 <w:cs/>
                 <w:lang w:bidi="ta-IN"/>
               </w:rPr>
-              <w:lastRenderedPageBreak/>
               <w:t>22</w:t>
             </w:r>
             <w:r>
@@ -17199,7 +17928,6 @@
                 <w:cs/>
                 <w:lang w:bidi="ta-IN"/>
               </w:rPr>
-              <w:lastRenderedPageBreak/>
               <w:t>20</w:t>
             </w:r>
             <w:r>
@@ -17605,7 +18333,6 @@
                 <w:cs/>
                 <w:lang w:bidi="ta-IN"/>
               </w:rPr>
-              <w:lastRenderedPageBreak/>
               <w:t>22</w:t>
             </w:r>
             <w:r>
@@ -18192,7 +18919,6 @@
                 <w:cs/>
                 <w:lang w:bidi="ta-IN"/>
               </w:rPr>
-              <w:lastRenderedPageBreak/>
               <w:t>3</w:t>
             </w:r>
             <w:r>
@@ -19513,6 +20239,42 @@
                 <w:b/>
                 <w:bCs/>
                 <w:szCs w:val="28"/>
+                <w:lang w:bidi="ta-IN"/>
+              </w:rPr>
+            </w:pPr>
+          </w:p>
+          <w:p>
+            <w:pPr>
+              <w:spacing w:before="0" w:line="240" w:lineRule="auto"/>
+              <w:rPr>
+                <w:rFonts w:cs="Latha"/>
+                <w:b/>
+                <w:bCs/>
+                <w:szCs w:val="28"/>
+                <w:lang w:bidi="ta-IN"/>
+              </w:rPr>
+            </w:pPr>
+          </w:p>
+          <w:p>
+            <w:pPr>
+              <w:spacing w:before="0" w:line="240" w:lineRule="auto"/>
+              <w:rPr>
+                <w:rFonts w:cs="Latha"/>
+                <w:b/>
+                <w:bCs/>
+                <w:szCs w:val="28"/>
+                <w:lang w:bidi="ta-IN"/>
+              </w:rPr>
+            </w:pPr>
+          </w:p>
+          <w:p>
+            <w:pPr>
+              <w:spacing w:before="0" w:line="240" w:lineRule="auto"/>
+              <w:rPr>
+                <w:rFonts w:cs="Latha"/>
+                <w:b/>
+                <w:bCs/>
+                <w:szCs w:val="28"/>
                 <w:cs/>
                 <w:lang w:bidi="ta-IN"/>
               </w:rPr>
@@ -19545,6 +20307,7 @@
                 <w:cs/>
                 <w:lang w:bidi="ta-IN"/>
               </w:rPr>
+              <w:lastRenderedPageBreak/>
               <w:t>1</w:t>
             </w:r>
             <w:r>
@@ -21683,7 +22446,6 @@
                 <w:cs/>
                 <w:lang w:bidi="ta-IN"/>
               </w:rPr>
-              <w:lastRenderedPageBreak/>
               <w:t>54)</w:t>
             </w:r>
             <w:r>
@@ -22024,7 +22786,6 @@
                 <w:cs/>
                 <w:lang w:bidi="ta-IN"/>
               </w:rPr>
-              <w:lastRenderedPageBreak/>
               <w:t>5</w:t>
             </w:r>
             <w:r>
@@ -22433,7 +23194,6 @@
                 <w:cs/>
                 <w:lang w:bidi="ta-IN"/>
               </w:rPr>
-              <w:lastRenderedPageBreak/>
               <w:t>54)</w:t>
             </w:r>
             <w:r>
@@ -22779,7 +23539,6 @@
                 <w:cs/>
                 <w:lang w:bidi="ta-IN"/>
               </w:rPr>
-              <w:lastRenderedPageBreak/>
               <w:t>8</w:t>
             </w:r>
             <w:r>
@@ -23738,6 +24497,7 @@
                 <w:sz w:val="36"/>
                 <w:szCs w:val="40"/>
               </w:rPr>
+              <w:lastRenderedPageBreak/>
               <w:t xml:space="preserve"> </w:t>
             </w:r>
           </w:p>
@@ -23766,6 +24526,7 @@
                 <w:cs/>
                 <w:lang w:bidi="ta-IN"/>
               </w:rPr>
+              <w:lastRenderedPageBreak/>
               <w:t>1</w:t>
             </w:r>
             <w:r>
@@ -24183,6 +24944,7 @@
                 <w:cs/>
                 <w:lang w:bidi="ta-IN"/>
               </w:rPr>
+              <w:lastRenderedPageBreak/>
               <w:t>38</w:t>
             </w:r>
             <w:r>
@@ -25002,7 +25764,6 @@
                 <w:cs/>
                 <w:lang w:bidi="ta-IN"/>
               </w:rPr>
-              <w:lastRenderedPageBreak/>
               <w:t>பாவ</w:t>
             </w:r>
             <w:r>
@@ -25162,7 +25923,6 @@
                 <w:sz w:val="32"/>
                 <w:szCs w:val="40"/>
               </w:rPr>
-              <w:lastRenderedPageBreak/>
               <w:t xml:space="preserve"> </w:t>
             </w:r>
             <w:r>
@@ -26020,7 +26780,6 @@
                 <w:cs/>
                 <w:lang w:bidi="ta-IN"/>
               </w:rPr>
-              <w:lastRenderedPageBreak/>
               <w:t>பாவ</w:t>
             </w:r>
             <w:r>
@@ -26185,7 +26944,6 @@
                 <w:cs/>
                 <w:lang w:bidi="ta-IN"/>
               </w:rPr>
-              <w:lastRenderedPageBreak/>
               <w:t>31</w:t>
             </w:r>
             <w:r>
@@ -26907,334 +27665,362 @@
               <w:adjustRightInd w:val="0"/>
               <w:spacing w:before="0" w:line="240" w:lineRule="auto"/>
               <w:rPr>
+                <w:rFonts w:ascii="Latha" w:hAnsi="Latha" w:cs="Latha"/>
+                <w:szCs w:val="28"/>
+                <w:lang w:bidi="ta-IN"/>
+              </w:rPr>
+            </w:pPr>
+            <w:r>
+              <w:rPr>
+                <w:rFonts w:ascii="Latha" w:hAnsi="Latha" w:cs="Latha"/>
+                <w:szCs w:val="28"/>
+                <w:cs/>
+                <w:lang w:bidi="ta-IN"/>
+              </w:rPr>
+              <w:t>அ</w:t>
+            </w:r>
+            <w:r>
+              <w:rPr>
+                <w:rFonts w:ascii="BRH Tamil Tab Extra" w:hAnsi="BRH Tamil Tab Extra" w:cs="Latha"/>
+                <w:b/>
+                <w:bCs/>
+                <w:sz w:val="32"/>
+                <w:szCs w:val="28"/>
+                <w:lang w:bidi="ta-IN"/>
+              </w:rPr>
+              <w:t>…</w:t>
+            </w:r>
+            <w:r>
+              <w:rPr>
+                <w:rFonts w:ascii="Latha" w:hAnsi="Latha" w:cs="Latha"/>
+                <w:szCs w:val="28"/>
+                <w:cs/>
+                <w:lang w:bidi="ta-IN"/>
+              </w:rPr>
+              <w:t>க்</w:t>
+            </w:r>
+            <w:r>
+              <w:rPr>
+                <w:rFonts w:ascii="Latha" w:hAnsi="Latha" w:cs="Latha"/>
+                <w:b/>
+                <w:bCs/>
+                <w:position w:val="-12"/>
+                <w:szCs w:val="28"/>
+                <w:cs/>
+                <w:lang w:bidi="ta-IN"/>
+              </w:rPr>
+              <w:t>3</w:t>
+            </w:r>
+            <w:r>
+              <w:rPr>
+                <w:rFonts w:ascii="Latha" w:hAnsi="Latha" w:cs="Latha"/>
+                <w:szCs w:val="28"/>
+                <w:cs/>
+                <w:lang w:bidi="ta-IN"/>
+              </w:rPr>
+              <w:t>னி</w:t>
+            </w:r>
+            <w:r>
+              <w:rPr>
+                <w:rFonts w:ascii="Latha" w:hAnsi="Latha" w:cs="Latha"/>
+                <w:b/>
+                <w:bCs/>
+                <w:szCs w:val="28"/>
+                <w:cs/>
+                <w:lang w:bidi="ta-IN"/>
+              </w:rPr>
+              <w:t>:</w:t>
+            </w:r>
+            <w:r>
+              <w:rPr>
+                <w:rFonts w:ascii="Latha" w:hAnsi="Latha" w:cs="Latha"/>
+                <w:szCs w:val="28"/>
+                <w:cs/>
+                <w:lang w:bidi="ta-IN"/>
+              </w:rPr>
+              <w:t xml:space="preserve"> ஸ்த</w:t>
+            </w:r>
+            <w:r>
+              <w:rPr>
+                <w:rFonts w:ascii="BRH Tamil Tab Extra" w:hAnsi="BRH Tamil Tab Extra" w:cs="Latha"/>
+                <w:b/>
+                <w:bCs/>
+                <w:sz w:val="32"/>
+                <w:szCs w:val="28"/>
+                <w:lang w:bidi="ta-IN"/>
+              </w:rPr>
+              <w:t>…</w:t>
+            </w:r>
+            <w:r>
+              <w:rPr>
+                <w:rFonts w:ascii="Latha" w:hAnsi="Latha" w:cs="Latha"/>
+                <w:szCs w:val="28"/>
+                <w:cs/>
+                <w:lang w:bidi="ta-IN"/>
+              </w:rPr>
+              <w:t>ன</w:t>
+            </w:r>
+            <w:r>
+              <w:rPr>
+                <w:rFonts w:ascii="Latha" w:hAnsi="Latha" w:cs="Latha"/>
+                <w:szCs w:val="28"/>
+                <w:highlight w:val="yellow"/>
+                <w:cs/>
+                <w:lang w:bidi="ta-IN"/>
+              </w:rPr>
+              <w:t>ய</w:t>
+            </w:r>
+            <w:r>
+              <w:rPr>
+                <w:rFonts w:ascii="BRH Tamil Tab Extra" w:hAnsi="BRH Tamil Tab Extra" w:cs="Latha"/>
+                <w:b/>
+                <w:bCs/>
+                <w:sz w:val="32"/>
+                <w:szCs w:val="28"/>
+                <w:lang w:bidi="ta-IN"/>
+              </w:rPr>
+              <w:t>†</w:t>
+            </w:r>
+            <w:r>
+              <w:rPr>
+                <w:rFonts w:ascii="Latha" w:hAnsi="Latha" w:cs="Latha"/>
+                <w:szCs w:val="28"/>
+                <w:cs/>
+                <w:lang w:bidi="ta-IN"/>
+              </w:rPr>
+              <w:t>ன் த்</w:t>
+            </w:r>
+            <w:r>
+              <w:rPr>
+                <w:rFonts w:ascii="Latha" w:hAnsi="Latha" w:cs="Latha"/>
+                <w:b/>
+                <w:bCs/>
+                <w:position w:val="-12"/>
+                <w:szCs w:val="28"/>
+                <w:cs/>
+                <w:lang w:bidi="ta-IN"/>
+              </w:rPr>
+              <w:t>2</w:t>
+            </w:r>
+            <w:r>
+              <w:rPr>
+                <w:rFonts w:ascii="Latha" w:hAnsi="Latha" w:cs="Latha"/>
+                <w:szCs w:val="28"/>
+                <w:cs/>
+                <w:lang w:bidi="ta-IN"/>
+              </w:rPr>
+              <w:t>ஸ்த</w:t>
+            </w:r>
+            <w:r>
+              <w:rPr>
+                <w:rFonts w:ascii="BRH Tamil Tab Extra" w:hAnsi="BRH Tamil Tab Extra" w:cs="Latha"/>
+                <w:b/>
+                <w:bCs/>
+                <w:sz w:val="32"/>
+                <w:szCs w:val="28"/>
+                <w:lang w:bidi="ta-IN"/>
+              </w:rPr>
+              <w:t>…</w:t>
+            </w:r>
+            <w:r>
+              <w:rPr>
+                <w:rFonts w:ascii="Latha" w:hAnsi="Latha" w:cs="Latha"/>
+                <w:szCs w:val="28"/>
+                <w:cs/>
+                <w:lang w:bidi="ta-IN"/>
+              </w:rPr>
+              <w:t>னய</w:t>
+            </w:r>
+            <w:r>
+              <w:rPr>
+                <w:rFonts w:ascii="BRH Tamil Tab Extra" w:hAnsi="BRH Tamil Tab Extra" w:cs="Latha"/>
+                <w:b/>
+                <w:bCs/>
+                <w:sz w:val="32"/>
+                <w:szCs w:val="28"/>
+                <w:lang w:bidi="ta-IN"/>
+              </w:rPr>
+              <w:t>†</w:t>
+            </w:r>
+            <w:r>
+              <w:rPr>
+                <w:rFonts w:ascii="Latha" w:hAnsi="Latha" w:cs="Latha"/>
+                <w:szCs w:val="28"/>
+                <w:cs/>
+                <w:lang w:bidi="ta-IN"/>
+              </w:rPr>
+              <w:t>ன் ந</w:t>
+            </w:r>
+            <w:r>
+              <w:rPr>
+                <w:rFonts w:ascii="BRH Tamil Tab Extra" w:hAnsi="BRH Tamil Tab Extra" w:cs="Latha"/>
+                <w:b/>
+                <w:bCs/>
+                <w:sz w:val="32"/>
+                <w:szCs w:val="28"/>
+                <w:lang w:bidi="ta-IN"/>
+              </w:rPr>
+              <w:t>…</w:t>
+            </w:r>
+            <w:r>
+              <w:rPr>
+                <w:rFonts w:ascii="Latha" w:hAnsi="Latha" w:cs="Latha"/>
+                <w:szCs w:val="28"/>
+                <w:cs/>
+                <w:lang w:bidi="ta-IN"/>
+              </w:rPr>
+              <w:t>க்</w:t>
+            </w:r>
+            <w:r>
+              <w:rPr>
+                <w:rFonts w:ascii="Latha" w:hAnsi="Latha" w:cs="Latha"/>
+                <w:b/>
+                <w:bCs/>
+                <w:position w:val="-12"/>
+                <w:szCs w:val="28"/>
+                <w:cs/>
+                <w:lang w:bidi="ta-IN"/>
+              </w:rPr>
+              <w:t>3</w:t>
+            </w:r>
+            <w:r>
+              <w:rPr>
+                <w:rFonts w:ascii="Latha" w:hAnsi="Latha" w:cs="Latha"/>
+                <w:szCs w:val="28"/>
+                <w:cs/>
+                <w:lang w:bidi="ta-IN"/>
+              </w:rPr>
+              <w:t>னி ர</w:t>
+            </w:r>
+            <w:r>
+              <w:rPr>
+                <w:rFonts w:ascii="BRH Tamil Tab Extra" w:hAnsi="BRH Tamil Tab Extra" w:cs="Latha"/>
+                <w:b/>
+                <w:bCs/>
+                <w:sz w:val="32"/>
+                <w:szCs w:val="28"/>
+                <w:lang w:bidi="ta-IN"/>
+              </w:rPr>
+              <w:t>…</w:t>
+            </w:r>
+            <w:r>
+              <w:rPr>
+                <w:rFonts w:ascii="Latha" w:hAnsi="Latha" w:cs="Latha"/>
+                <w:szCs w:val="28"/>
+                <w:cs/>
+                <w:lang w:bidi="ta-IN"/>
+              </w:rPr>
+              <w:t>க்</w:t>
+            </w:r>
+            <w:r>
+              <w:rPr>
+                <w:rFonts w:ascii="Latha" w:hAnsi="Latha" w:cs="Latha"/>
+                <w:b/>
+                <w:bCs/>
+                <w:position w:val="-12"/>
+                <w:szCs w:val="28"/>
+                <w:cs/>
+                <w:lang w:bidi="ta-IN"/>
+              </w:rPr>
+              <w:t>3</w:t>
+            </w:r>
+            <w:r>
+              <w:rPr>
+                <w:rFonts w:ascii="Latha" w:hAnsi="Latha" w:cs="Latha"/>
+                <w:szCs w:val="28"/>
+                <w:cs/>
+                <w:lang w:bidi="ta-IN"/>
+              </w:rPr>
+              <w:t>னி</w:t>
+            </w:r>
+            <w:r>
+              <w:rPr>
+                <w:rFonts w:ascii="Latha" w:hAnsi="Latha" w:cs="Latha"/>
+                <w:b/>
+                <w:bCs/>
+                <w:szCs w:val="28"/>
+                <w:cs/>
+                <w:lang w:bidi="ta-IN"/>
+              </w:rPr>
+              <w:t>:</w:t>
+            </w:r>
+            <w:r>
+              <w:rPr>
+                <w:rFonts w:ascii="Latha" w:hAnsi="Latha" w:cs="Latha"/>
+                <w:szCs w:val="28"/>
+                <w:cs/>
+                <w:lang w:bidi="ta-IN"/>
+              </w:rPr>
+              <w:t xml:space="preserve"> ஸ்த</w:t>
+            </w:r>
+            <w:r>
+              <w:rPr>
+                <w:rFonts w:ascii="BRH Tamil Tab Extra" w:hAnsi="BRH Tamil Tab Extra" w:cs="Latha"/>
+                <w:b/>
+                <w:bCs/>
+                <w:sz w:val="32"/>
+                <w:szCs w:val="28"/>
+                <w:lang w:bidi="ta-IN"/>
+              </w:rPr>
+              <w:t>…</w:t>
+            </w:r>
+            <w:r>
+              <w:rPr>
+                <w:rFonts w:ascii="Latha" w:hAnsi="Latha" w:cs="Latha"/>
+                <w:szCs w:val="28"/>
+                <w:cs/>
+                <w:lang w:bidi="ta-IN"/>
+              </w:rPr>
+              <w:t>னயன்ன்</w:t>
+            </w:r>
+            <w:r>
+              <w:rPr>
+                <w:rFonts w:ascii="BRH Tamil Tab Extra" w:hAnsi="BRH Tamil Tab Extra" w:cs="Latha"/>
+                <w:b/>
+                <w:bCs/>
+                <w:sz w:val="32"/>
+                <w:szCs w:val="28"/>
+                <w:lang w:bidi="ta-IN"/>
+              </w:rPr>
+              <w:t>†</w:t>
+            </w:r>
+            <w:r>
+              <w:rPr>
+                <w:rFonts w:ascii="Latha" w:hAnsi="Latha" w:cs="Latha"/>
+                <w:szCs w:val="28"/>
+                <w:lang w:bidi="ta-IN"/>
+              </w:rPr>
+              <w:t xml:space="preserve"> |</w:t>
+            </w:r>
+          </w:p>
+          <w:p>
+            <w:pPr>
+              <w:widowControl w:val="0"/>
+              <w:autoSpaceDE w:val="0"/>
+              <w:autoSpaceDN w:val="0"/>
+              <w:adjustRightInd w:val="0"/>
+              <w:spacing w:before="0" w:line="240" w:lineRule="auto"/>
+              <w:rPr>
+                <w:rFonts w:ascii="Latha" w:hAnsi="Latha" w:cs="Latha"/>
+                <w:color w:val="000000"/>
+                <w:szCs w:val="28"/>
+              </w:rPr>
+            </w:pPr>
+          </w:p>
+          <w:p>
+            <w:pPr>
+              <w:widowControl w:val="0"/>
+              <w:autoSpaceDE w:val="0"/>
+              <w:autoSpaceDN w:val="0"/>
+              <w:adjustRightInd w:val="0"/>
+              <w:spacing w:before="0" w:line="240" w:lineRule="auto"/>
+              <w:rPr>
                 <w:rFonts w:ascii="BRH Devanagari Extra" w:hAnsi="BRH Devanagari Extra" w:cs="BRH Devanagari Extra"/>
                 <w:color w:val="000000"/>
                 <w:sz w:val="32"/>
                 <w:szCs w:val="40"/>
               </w:rPr>
             </w:pPr>
-            <w:r>
-              <w:rPr>
-                <w:rFonts w:ascii="Latha" w:hAnsi="Latha" w:cs="Latha"/>
-                <w:szCs w:val="28"/>
-                <w:cs/>
-                <w:lang w:bidi="ta-IN"/>
-              </w:rPr>
-              <w:t>அ</w:t>
-            </w:r>
-            <w:r>
-              <w:rPr>
-                <w:rFonts w:ascii="BRH Tamil Tab Extra" w:hAnsi="BRH Tamil Tab Extra" w:cs="Latha"/>
-                <w:b/>
-                <w:bCs/>
-                <w:sz w:val="32"/>
-                <w:szCs w:val="28"/>
-                <w:lang w:bidi="ta-IN"/>
-              </w:rPr>
-              <w:t>…</w:t>
-            </w:r>
-            <w:r>
-              <w:rPr>
-                <w:rFonts w:ascii="Latha" w:hAnsi="Latha" w:cs="Latha"/>
-                <w:szCs w:val="28"/>
-                <w:cs/>
-                <w:lang w:bidi="ta-IN"/>
-              </w:rPr>
-              <w:t>க்</w:t>
-            </w:r>
-            <w:r>
-              <w:rPr>
-                <w:rFonts w:ascii="Latha" w:hAnsi="Latha" w:cs="Latha"/>
-                <w:b/>
-                <w:bCs/>
-                <w:position w:val="-12"/>
-                <w:szCs w:val="28"/>
-                <w:cs/>
-                <w:lang w:bidi="ta-IN"/>
-              </w:rPr>
-              <w:t>3</w:t>
-            </w:r>
-            <w:r>
-              <w:rPr>
-                <w:rFonts w:ascii="Latha" w:hAnsi="Latha" w:cs="Latha"/>
-                <w:szCs w:val="28"/>
-                <w:cs/>
-                <w:lang w:bidi="ta-IN"/>
-              </w:rPr>
-              <w:t>னி</w:t>
-            </w:r>
-            <w:r>
-              <w:rPr>
-                <w:rFonts w:ascii="Latha" w:hAnsi="Latha" w:cs="Latha"/>
-                <w:b/>
-                <w:bCs/>
-                <w:szCs w:val="28"/>
-                <w:cs/>
-                <w:lang w:bidi="ta-IN"/>
-              </w:rPr>
-              <w:t>:</w:t>
-            </w:r>
-            <w:r>
-              <w:rPr>
-                <w:rFonts w:ascii="Latha" w:hAnsi="Latha" w:cs="Latha"/>
-                <w:szCs w:val="28"/>
-                <w:cs/>
-                <w:lang w:bidi="ta-IN"/>
-              </w:rPr>
-              <w:t xml:space="preserve"> ஸ்த</w:t>
-            </w:r>
-            <w:r>
-              <w:rPr>
-                <w:rFonts w:ascii="BRH Tamil Tab Extra" w:hAnsi="BRH Tamil Tab Extra" w:cs="Latha"/>
-                <w:b/>
-                <w:bCs/>
-                <w:sz w:val="32"/>
-                <w:szCs w:val="28"/>
-                <w:lang w:bidi="ta-IN"/>
-              </w:rPr>
-              <w:t>…</w:t>
-            </w:r>
-            <w:r>
-              <w:rPr>
-                <w:rFonts w:ascii="Latha" w:hAnsi="Latha" w:cs="Latha"/>
-                <w:szCs w:val="28"/>
-                <w:cs/>
-                <w:lang w:bidi="ta-IN"/>
-              </w:rPr>
-              <w:t>ன</w:t>
-            </w:r>
-            <w:r>
-              <w:rPr>
-                <w:rFonts w:ascii="Latha" w:hAnsi="Latha" w:cs="Latha"/>
-                <w:szCs w:val="28"/>
-                <w:highlight w:val="yellow"/>
-                <w:cs/>
-                <w:lang w:bidi="ta-IN"/>
-              </w:rPr>
-              <w:t>ய</w:t>
-            </w:r>
-            <w:r>
-              <w:rPr>
-                <w:rFonts w:ascii="BRH Tamil Tab Extra" w:hAnsi="BRH Tamil Tab Extra" w:cs="Latha"/>
-                <w:b/>
-                <w:bCs/>
-                <w:sz w:val="32"/>
-                <w:szCs w:val="28"/>
-                <w:lang w:bidi="ta-IN"/>
-              </w:rPr>
-              <w:t>†</w:t>
-            </w:r>
-            <w:r>
-              <w:rPr>
-                <w:rFonts w:ascii="Latha" w:hAnsi="Latha" w:cs="Latha"/>
-                <w:szCs w:val="28"/>
-                <w:cs/>
-                <w:lang w:bidi="ta-IN"/>
-              </w:rPr>
-              <w:t>ன் த்</w:t>
-            </w:r>
-            <w:r>
-              <w:rPr>
-                <w:rFonts w:ascii="Latha" w:hAnsi="Latha" w:cs="Latha"/>
-                <w:b/>
-                <w:bCs/>
-                <w:position w:val="-12"/>
-                <w:szCs w:val="28"/>
-                <w:cs/>
-                <w:lang w:bidi="ta-IN"/>
-              </w:rPr>
-              <w:t>2</w:t>
-            </w:r>
-            <w:r>
-              <w:rPr>
-                <w:rFonts w:ascii="Latha" w:hAnsi="Latha" w:cs="Latha"/>
-                <w:szCs w:val="28"/>
-                <w:cs/>
-                <w:lang w:bidi="ta-IN"/>
-              </w:rPr>
-              <w:t>ஸ்த</w:t>
-            </w:r>
-            <w:r>
-              <w:rPr>
-                <w:rFonts w:ascii="BRH Tamil Tab Extra" w:hAnsi="BRH Tamil Tab Extra" w:cs="Latha"/>
-                <w:b/>
-                <w:bCs/>
-                <w:sz w:val="32"/>
-                <w:szCs w:val="28"/>
-                <w:lang w:bidi="ta-IN"/>
-              </w:rPr>
-              <w:t>…</w:t>
-            </w:r>
-            <w:r>
-              <w:rPr>
-                <w:rFonts w:ascii="Latha" w:hAnsi="Latha" w:cs="Latha"/>
-                <w:szCs w:val="28"/>
-                <w:cs/>
-                <w:lang w:bidi="ta-IN"/>
-              </w:rPr>
-              <w:t>னய</w:t>
-            </w:r>
-            <w:r>
-              <w:rPr>
-                <w:rFonts w:ascii="BRH Tamil Tab Extra" w:hAnsi="BRH Tamil Tab Extra" w:cs="Latha"/>
-                <w:b/>
-                <w:bCs/>
-                <w:sz w:val="32"/>
-                <w:szCs w:val="28"/>
-                <w:lang w:bidi="ta-IN"/>
-              </w:rPr>
-              <w:t>†</w:t>
-            </w:r>
-            <w:r>
-              <w:rPr>
-                <w:rFonts w:ascii="Latha" w:hAnsi="Latha" w:cs="Latha"/>
-                <w:szCs w:val="28"/>
-                <w:cs/>
-                <w:lang w:bidi="ta-IN"/>
-              </w:rPr>
-              <w:t>ன் ந</w:t>
-            </w:r>
-            <w:r>
-              <w:rPr>
-                <w:rFonts w:ascii="BRH Tamil Tab Extra" w:hAnsi="BRH Tamil Tab Extra" w:cs="Latha"/>
-                <w:b/>
-                <w:bCs/>
-                <w:sz w:val="32"/>
-                <w:szCs w:val="28"/>
-                <w:lang w:bidi="ta-IN"/>
-              </w:rPr>
-              <w:t>…</w:t>
-            </w:r>
-            <w:r>
-              <w:rPr>
-                <w:rFonts w:ascii="Latha" w:hAnsi="Latha" w:cs="Latha"/>
-                <w:szCs w:val="28"/>
-                <w:cs/>
-                <w:lang w:bidi="ta-IN"/>
-              </w:rPr>
-              <w:t>க்</w:t>
-            </w:r>
-            <w:r>
-              <w:rPr>
-                <w:rFonts w:ascii="Latha" w:hAnsi="Latha" w:cs="Latha"/>
-                <w:b/>
-                <w:bCs/>
-                <w:position w:val="-12"/>
-                <w:szCs w:val="28"/>
-                <w:cs/>
-                <w:lang w:bidi="ta-IN"/>
-              </w:rPr>
-              <w:t>3</w:t>
-            </w:r>
-            <w:r>
-              <w:rPr>
-                <w:rFonts w:ascii="Latha" w:hAnsi="Latha" w:cs="Latha"/>
-                <w:szCs w:val="28"/>
-                <w:cs/>
-                <w:lang w:bidi="ta-IN"/>
-              </w:rPr>
-              <w:t>னி ர</w:t>
-            </w:r>
-            <w:r>
-              <w:rPr>
-                <w:rFonts w:ascii="BRH Tamil Tab Extra" w:hAnsi="BRH Tamil Tab Extra" w:cs="Latha"/>
-                <w:b/>
-                <w:bCs/>
-                <w:sz w:val="32"/>
-                <w:szCs w:val="28"/>
-                <w:lang w:bidi="ta-IN"/>
-              </w:rPr>
-              <w:t>…</w:t>
-            </w:r>
-            <w:r>
-              <w:rPr>
-                <w:rFonts w:ascii="Latha" w:hAnsi="Latha" w:cs="Latha"/>
-                <w:szCs w:val="28"/>
-                <w:cs/>
-                <w:lang w:bidi="ta-IN"/>
-              </w:rPr>
-              <w:t>க்</w:t>
-            </w:r>
-            <w:r>
-              <w:rPr>
-                <w:rFonts w:ascii="Latha" w:hAnsi="Latha" w:cs="Latha"/>
-                <w:b/>
-                <w:bCs/>
-                <w:position w:val="-12"/>
-                <w:szCs w:val="28"/>
-                <w:cs/>
-                <w:lang w:bidi="ta-IN"/>
-              </w:rPr>
-              <w:t>3</w:t>
-            </w:r>
-            <w:r>
-              <w:rPr>
-                <w:rFonts w:ascii="Latha" w:hAnsi="Latha" w:cs="Latha"/>
-                <w:szCs w:val="28"/>
-                <w:cs/>
-                <w:lang w:bidi="ta-IN"/>
-              </w:rPr>
-              <w:t>னி</w:t>
-            </w:r>
-            <w:r>
-              <w:rPr>
-                <w:rFonts w:ascii="Latha" w:hAnsi="Latha" w:cs="Latha"/>
-                <w:b/>
-                <w:bCs/>
-                <w:szCs w:val="28"/>
-                <w:cs/>
-                <w:lang w:bidi="ta-IN"/>
-              </w:rPr>
-              <w:t>:</w:t>
-            </w:r>
-            <w:r>
-              <w:rPr>
-                <w:rFonts w:ascii="Latha" w:hAnsi="Latha" w:cs="Latha"/>
-                <w:szCs w:val="28"/>
-                <w:cs/>
-                <w:lang w:bidi="ta-IN"/>
-              </w:rPr>
-              <w:t xml:space="preserve"> ஸ்த</w:t>
-            </w:r>
-            <w:r>
-              <w:rPr>
-                <w:rFonts w:ascii="BRH Tamil Tab Extra" w:hAnsi="BRH Tamil Tab Extra" w:cs="Latha"/>
-                <w:b/>
-                <w:bCs/>
-                <w:sz w:val="32"/>
-                <w:szCs w:val="28"/>
-                <w:lang w:bidi="ta-IN"/>
-              </w:rPr>
-              <w:t>…</w:t>
-            </w:r>
-            <w:r>
-              <w:rPr>
-                <w:rFonts w:ascii="Latha" w:hAnsi="Latha" w:cs="Latha"/>
-                <w:szCs w:val="28"/>
-                <w:cs/>
-                <w:lang w:bidi="ta-IN"/>
-              </w:rPr>
-              <w:t>னயன்ன்</w:t>
-            </w:r>
-            <w:r>
-              <w:rPr>
-                <w:rFonts w:ascii="BRH Tamil Tab Extra" w:hAnsi="BRH Tamil Tab Extra" w:cs="Latha"/>
-                <w:b/>
-                <w:bCs/>
-                <w:sz w:val="32"/>
-                <w:szCs w:val="28"/>
-                <w:lang w:bidi="ta-IN"/>
-              </w:rPr>
-              <w:t>†</w:t>
-            </w:r>
-            <w:r>
-              <w:rPr>
-                <w:rFonts w:ascii="Latha" w:hAnsi="Latha" w:cs="Latha"/>
-                <w:szCs w:val="28"/>
-                <w:lang w:bidi="ta-IN"/>
-              </w:rPr>
-              <w:t xml:space="preserve"> |</w:t>
-            </w:r>
           </w:p>
           <w:p>
             <w:pPr>
@@ -27256,6 +28042,7 @@
                 <w:cs/>
                 <w:lang w:bidi="ta-IN"/>
               </w:rPr>
+              <w:lastRenderedPageBreak/>
               <w:t>32</w:t>
             </w:r>
             <w:r>
@@ -27655,6 +28442,7 @@
                 <w:cs/>
                 <w:lang w:bidi="ta-IN"/>
               </w:rPr>
+              <w:lastRenderedPageBreak/>
               <w:t>31</w:t>
             </w:r>
             <w:r>
@@ -27882,335 +28670,363 @@
               <w:adjustRightInd w:val="0"/>
               <w:spacing w:before="0" w:line="240" w:lineRule="auto"/>
               <w:rPr>
+                <w:rFonts w:ascii="Latha" w:hAnsi="Latha" w:cs="Latha"/>
+                <w:szCs w:val="28"/>
+                <w:lang w:bidi="ta-IN"/>
+              </w:rPr>
+            </w:pPr>
+            <w:r>
+              <w:rPr>
+                <w:rFonts w:ascii="Latha" w:hAnsi="Latha" w:cs="Latha"/>
+                <w:szCs w:val="28"/>
+                <w:cs/>
+                <w:lang w:bidi="ta-IN"/>
+              </w:rPr>
+              <w:t>அ</w:t>
+            </w:r>
+            <w:r>
+              <w:rPr>
+                <w:rFonts w:ascii="BRH Tamil Tab Extra" w:hAnsi="BRH Tamil Tab Extra" w:cs="Latha"/>
+                <w:b/>
+                <w:bCs/>
+                <w:sz w:val="32"/>
+                <w:szCs w:val="28"/>
+                <w:lang w:bidi="ta-IN"/>
+              </w:rPr>
+              <w:t>…</w:t>
+            </w:r>
+            <w:r>
+              <w:rPr>
+                <w:rFonts w:ascii="Latha" w:hAnsi="Latha" w:cs="Latha"/>
+                <w:szCs w:val="28"/>
+                <w:cs/>
+                <w:lang w:bidi="ta-IN"/>
+              </w:rPr>
+              <w:t>க்</w:t>
+            </w:r>
+            <w:r>
+              <w:rPr>
+                <w:rFonts w:ascii="Latha" w:hAnsi="Latha" w:cs="Latha"/>
+                <w:b/>
+                <w:bCs/>
+                <w:position w:val="-12"/>
+                <w:szCs w:val="28"/>
+                <w:cs/>
+                <w:lang w:bidi="ta-IN"/>
+              </w:rPr>
+              <w:t>3</w:t>
+            </w:r>
+            <w:r>
+              <w:rPr>
+                <w:rFonts w:ascii="Latha" w:hAnsi="Latha" w:cs="Latha"/>
+                <w:szCs w:val="28"/>
+                <w:cs/>
+                <w:lang w:bidi="ta-IN"/>
+              </w:rPr>
+              <w:t>னி</w:t>
+            </w:r>
+            <w:r>
+              <w:rPr>
+                <w:rFonts w:ascii="Latha" w:hAnsi="Latha" w:cs="Latha"/>
+                <w:b/>
+                <w:bCs/>
+                <w:szCs w:val="28"/>
+                <w:cs/>
+                <w:lang w:bidi="ta-IN"/>
+              </w:rPr>
+              <w:t>:</w:t>
+            </w:r>
+            <w:r>
+              <w:rPr>
+                <w:rFonts w:ascii="Latha" w:hAnsi="Latha" w:cs="Latha"/>
+                <w:szCs w:val="28"/>
+                <w:cs/>
+                <w:lang w:bidi="ta-IN"/>
+              </w:rPr>
+              <w:t xml:space="preserve"> ஸ்த</w:t>
+            </w:r>
+            <w:r>
+              <w:rPr>
+                <w:rFonts w:ascii="BRH Tamil Tab Extra" w:hAnsi="BRH Tamil Tab Extra" w:cs="Latha"/>
+                <w:b/>
+                <w:bCs/>
+                <w:sz w:val="32"/>
+                <w:szCs w:val="28"/>
+                <w:lang w:bidi="ta-IN"/>
+              </w:rPr>
+              <w:t>…</w:t>
+            </w:r>
+            <w:r>
+              <w:rPr>
+                <w:rFonts w:ascii="Latha" w:hAnsi="Latha" w:cs="Latha"/>
+                <w:szCs w:val="28"/>
+                <w:cs/>
+                <w:lang w:bidi="ta-IN"/>
+              </w:rPr>
+              <w:t>ன</w:t>
+            </w:r>
+            <w:r>
+              <w:rPr>
+                <w:rFonts w:ascii="Latha" w:hAnsi="Latha" w:cs="Latha"/>
+                <w:szCs w:val="28"/>
+                <w:highlight w:val="green"/>
+                <w:cs/>
+                <w:lang w:bidi="ta-IN"/>
+              </w:rPr>
+              <w:t>ய</w:t>
+            </w:r>
+            <w:r>
+              <w:rPr>
+                <w:rFonts w:ascii="BRH Tamil Tab Extra" w:hAnsi="BRH Tamil Tab Extra" w:cs="Latha"/>
+                <w:b/>
+                <w:bCs/>
+                <w:sz w:val="32"/>
+                <w:szCs w:val="28"/>
+                <w:highlight w:val="green"/>
+                <w:lang w:bidi="ta-IN"/>
+              </w:rPr>
+              <w:t>‡</w:t>
+            </w:r>
+            <w:r>
+              <w:rPr>
+                <w:rFonts w:ascii="Latha" w:hAnsi="Latha" w:cs="Latha"/>
+                <w:szCs w:val="28"/>
+                <w:cs/>
+                <w:lang w:bidi="ta-IN"/>
+              </w:rPr>
+              <w:t>ன் த்</w:t>
+            </w:r>
+            <w:r>
+              <w:rPr>
+                <w:rFonts w:ascii="Latha" w:hAnsi="Latha" w:cs="Latha"/>
+                <w:b/>
+                <w:bCs/>
+                <w:position w:val="-12"/>
+                <w:szCs w:val="28"/>
+                <w:cs/>
+                <w:lang w:bidi="ta-IN"/>
+              </w:rPr>
+              <w:t>2</w:t>
+            </w:r>
+            <w:r>
+              <w:rPr>
+                <w:rFonts w:ascii="Latha" w:hAnsi="Latha" w:cs="Latha"/>
+                <w:szCs w:val="28"/>
+                <w:cs/>
+                <w:lang w:bidi="ta-IN"/>
+              </w:rPr>
+              <w:t>ஸ்த</w:t>
+            </w:r>
+            <w:r>
+              <w:rPr>
+                <w:rFonts w:ascii="BRH Tamil Tab Extra" w:hAnsi="BRH Tamil Tab Extra" w:cs="Latha"/>
+                <w:b/>
+                <w:bCs/>
+                <w:sz w:val="32"/>
+                <w:szCs w:val="28"/>
+                <w:lang w:bidi="ta-IN"/>
+              </w:rPr>
+              <w:t>…</w:t>
+            </w:r>
+            <w:r>
+              <w:rPr>
+                <w:rFonts w:ascii="Latha" w:hAnsi="Latha" w:cs="Latha"/>
+                <w:szCs w:val="28"/>
+                <w:cs/>
+                <w:lang w:bidi="ta-IN"/>
+              </w:rPr>
+              <w:t>னய</w:t>
+            </w:r>
+            <w:r>
+              <w:rPr>
+                <w:rFonts w:ascii="BRH Tamil Tab Extra" w:hAnsi="BRH Tamil Tab Extra" w:cs="Latha"/>
+                <w:b/>
+                <w:bCs/>
+                <w:sz w:val="32"/>
+                <w:szCs w:val="28"/>
+                <w:lang w:bidi="ta-IN"/>
+              </w:rPr>
+              <w:t>†</w:t>
+            </w:r>
+            <w:r>
+              <w:rPr>
+                <w:rFonts w:ascii="Latha" w:hAnsi="Latha" w:cs="Latha"/>
+                <w:szCs w:val="28"/>
+                <w:cs/>
+                <w:lang w:bidi="ta-IN"/>
+              </w:rPr>
+              <w:t>ன் ந</w:t>
+            </w:r>
+            <w:r>
+              <w:rPr>
+                <w:rFonts w:ascii="BRH Tamil Tab Extra" w:hAnsi="BRH Tamil Tab Extra" w:cs="Latha"/>
+                <w:b/>
+                <w:bCs/>
+                <w:sz w:val="32"/>
+                <w:szCs w:val="28"/>
+                <w:lang w:bidi="ta-IN"/>
+              </w:rPr>
+              <w:t>…</w:t>
+            </w:r>
+            <w:r>
+              <w:rPr>
+                <w:rFonts w:ascii="Latha" w:hAnsi="Latha" w:cs="Latha"/>
+                <w:szCs w:val="28"/>
+                <w:cs/>
+                <w:lang w:bidi="ta-IN"/>
+              </w:rPr>
+              <w:t>க்</w:t>
+            </w:r>
+            <w:r>
+              <w:rPr>
+                <w:rFonts w:ascii="Latha" w:hAnsi="Latha" w:cs="Latha"/>
+                <w:b/>
+                <w:bCs/>
+                <w:position w:val="-12"/>
+                <w:szCs w:val="28"/>
+                <w:cs/>
+                <w:lang w:bidi="ta-IN"/>
+              </w:rPr>
+              <w:t>3</w:t>
+            </w:r>
+            <w:r>
+              <w:rPr>
+                <w:rFonts w:ascii="Latha" w:hAnsi="Latha" w:cs="Latha"/>
+                <w:szCs w:val="28"/>
+                <w:cs/>
+                <w:lang w:bidi="ta-IN"/>
+              </w:rPr>
+              <w:t>னி ர</w:t>
+            </w:r>
+            <w:r>
+              <w:rPr>
+                <w:rFonts w:ascii="BRH Tamil Tab Extra" w:hAnsi="BRH Tamil Tab Extra" w:cs="Latha"/>
+                <w:b/>
+                <w:bCs/>
+                <w:sz w:val="32"/>
+                <w:szCs w:val="28"/>
+                <w:lang w:bidi="ta-IN"/>
+              </w:rPr>
+              <w:t>…</w:t>
+            </w:r>
+            <w:r>
+              <w:rPr>
+                <w:rFonts w:ascii="Latha" w:hAnsi="Latha" w:cs="Latha"/>
+                <w:szCs w:val="28"/>
+                <w:cs/>
+                <w:lang w:bidi="ta-IN"/>
+              </w:rPr>
+              <w:t>க்</w:t>
+            </w:r>
+            <w:r>
+              <w:rPr>
+                <w:rFonts w:ascii="Latha" w:hAnsi="Latha" w:cs="Latha"/>
+                <w:b/>
+                <w:bCs/>
+                <w:position w:val="-12"/>
+                <w:szCs w:val="28"/>
+                <w:cs/>
+                <w:lang w:bidi="ta-IN"/>
+              </w:rPr>
+              <w:t>3</w:t>
+            </w:r>
+            <w:r>
+              <w:rPr>
+                <w:rFonts w:ascii="Latha" w:hAnsi="Latha" w:cs="Latha"/>
+                <w:szCs w:val="28"/>
+                <w:cs/>
+                <w:lang w:bidi="ta-IN"/>
+              </w:rPr>
+              <w:t>னி</w:t>
+            </w:r>
+            <w:r>
+              <w:rPr>
+                <w:rFonts w:ascii="Latha" w:hAnsi="Latha" w:cs="Latha"/>
+                <w:b/>
+                <w:bCs/>
+                <w:szCs w:val="28"/>
+                <w:cs/>
+                <w:lang w:bidi="ta-IN"/>
+              </w:rPr>
+              <w:t>:</w:t>
+            </w:r>
+            <w:r>
+              <w:rPr>
+                <w:rFonts w:ascii="Latha" w:hAnsi="Latha" w:cs="Latha"/>
+                <w:szCs w:val="28"/>
+                <w:cs/>
+                <w:lang w:bidi="ta-IN"/>
+              </w:rPr>
+              <w:t xml:space="preserve"> ஸ்த</w:t>
+            </w:r>
+            <w:r>
+              <w:rPr>
+                <w:rFonts w:ascii="BRH Tamil Tab Extra" w:hAnsi="BRH Tamil Tab Extra" w:cs="Latha"/>
+                <w:b/>
+                <w:bCs/>
+                <w:sz w:val="32"/>
+                <w:szCs w:val="28"/>
+                <w:lang w:bidi="ta-IN"/>
+              </w:rPr>
+              <w:t>…</w:t>
+            </w:r>
+            <w:r>
+              <w:rPr>
+                <w:rFonts w:ascii="Latha" w:hAnsi="Latha" w:cs="Latha"/>
+                <w:szCs w:val="28"/>
+                <w:cs/>
+                <w:lang w:bidi="ta-IN"/>
+              </w:rPr>
+              <w:t>னயன்ன்</w:t>
+            </w:r>
+            <w:r>
+              <w:rPr>
+                <w:rFonts w:ascii="BRH Tamil Tab Extra" w:hAnsi="BRH Tamil Tab Extra" w:cs="Latha"/>
+                <w:b/>
+                <w:bCs/>
+                <w:sz w:val="32"/>
+                <w:szCs w:val="28"/>
+                <w:lang w:bidi="ta-IN"/>
+              </w:rPr>
+              <w:t>†</w:t>
+            </w:r>
+            <w:r>
+              <w:rPr>
+                <w:rFonts w:ascii="Latha" w:hAnsi="Latha" w:cs="Latha"/>
+                <w:szCs w:val="28"/>
+                <w:lang w:bidi="ta-IN"/>
+              </w:rPr>
+              <w:t xml:space="preserve"> |</w:t>
+            </w:r>
+          </w:p>
+          <w:p>
+            <w:pPr>
+              <w:widowControl w:val="0"/>
+              <w:autoSpaceDE w:val="0"/>
+              <w:autoSpaceDN w:val="0"/>
+              <w:adjustRightInd w:val="0"/>
+              <w:spacing w:before="0" w:line="240" w:lineRule="auto"/>
+              <w:rPr>
+                <w:rFonts w:ascii="Latha" w:hAnsi="Latha" w:cs="Latha"/>
+                <w:color w:val="000000"/>
+                <w:szCs w:val="28"/>
+              </w:rPr>
+            </w:pPr>
+          </w:p>
+          <w:p>
+            <w:pPr>
+              <w:widowControl w:val="0"/>
+              <w:autoSpaceDE w:val="0"/>
+              <w:autoSpaceDN w:val="0"/>
+              <w:adjustRightInd w:val="0"/>
+              <w:spacing w:before="0" w:line="240" w:lineRule="auto"/>
+              <w:rPr>
                 <w:rFonts w:ascii="BRH Devanagari Extra" w:hAnsi="BRH Devanagari Extra" w:cs="BRH Devanagari Extra"/>
                 <w:color w:val="000000"/>
                 <w:sz w:val="32"/>
                 <w:szCs w:val="40"/>
               </w:rPr>
             </w:pPr>
-            <w:r>
-              <w:rPr>
-                <w:rFonts w:ascii="Latha" w:hAnsi="Latha" w:cs="Latha"/>
-                <w:szCs w:val="28"/>
-                <w:cs/>
-                <w:lang w:bidi="ta-IN"/>
-              </w:rPr>
-              <w:t>அ</w:t>
-            </w:r>
-            <w:r>
-              <w:rPr>
-                <w:rFonts w:ascii="BRH Tamil Tab Extra" w:hAnsi="BRH Tamil Tab Extra" w:cs="Latha"/>
-                <w:b/>
-                <w:bCs/>
-                <w:sz w:val="32"/>
-                <w:szCs w:val="28"/>
-                <w:lang w:bidi="ta-IN"/>
-              </w:rPr>
-              <w:t>…</w:t>
-            </w:r>
-            <w:r>
-              <w:rPr>
-                <w:rFonts w:ascii="Latha" w:hAnsi="Latha" w:cs="Latha"/>
-                <w:szCs w:val="28"/>
-                <w:cs/>
-                <w:lang w:bidi="ta-IN"/>
-              </w:rPr>
-              <w:t>க்</w:t>
-            </w:r>
-            <w:r>
-              <w:rPr>
-                <w:rFonts w:ascii="Latha" w:hAnsi="Latha" w:cs="Latha"/>
-                <w:b/>
-                <w:bCs/>
-                <w:position w:val="-12"/>
-                <w:szCs w:val="28"/>
-                <w:cs/>
-                <w:lang w:bidi="ta-IN"/>
-              </w:rPr>
-              <w:t>3</w:t>
-            </w:r>
-            <w:r>
-              <w:rPr>
-                <w:rFonts w:ascii="Latha" w:hAnsi="Latha" w:cs="Latha"/>
-                <w:szCs w:val="28"/>
-                <w:cs/>
-                <w:lang w:bidi="ta-IN"/>
-              </w:rPr>
-              <w:t>னி</w:t>
-            </w:r>
-            <w:r>
-              <w:rPr>
-                <w:rFonts w:ascii="Latha" w:hAnsi="Latha" w:cs="Latha"/>
-                <w:b/>
-                <w:bCs/>
-                <w:szCs w:val="28"/>
-                <w:cs/>
-                <w:lang w:bidi="ta-IN"/>
-              </w:rPr>
-              <w:t>:</w:t>
-            </w:r>
-            <w:r>
-              <w:rPr>
-                <w:rFonts w:ascii="Latha" w:hAnsi="Latha" w:cs="Latha"/>
-                <w:szCs w:val="28"/>
-                <w:cs/>
-                <w:lang w:bidi="ta-IN"/>
-              </w:rPr>
-              <w:t xml:space="preserve"> ஸ்த</w:t>
-            </w:r>
-            <w:r>
-              <w:rPr>
-                <w:rFonts w:ascii="BRH Tamil Tab Extra" w:hAnsi="BRH Tamil Tab Extra" w:cs="Latha"/>
-                <w:b/>
-                <w:bCs/>
-                <w:sz w:val="32"/>
-                <w:szCs w:val="28"/>
-                <w:lang w:bidi="ta-IN"/>
-              </w:rPr>
-              <w:t>…</w:t>
-            </w:r>
-            <w:r>
-              <w:rPr>
-                <w:rFonts w:ascii="Latha" w:hAnsi="Latha" w:cs="Latha"/>
-                <w:szCs w:val="28"/>
-                <w:cs/>
-                <w:lang w:bidi="ta-IN"/>
-              </w:rPr>
-              <w:t>ன</w:t>
-            </w:r>
-            <w:r>
-              <w:rPr>
-                <w:rFonts w:ascii="Latha" w:hAnsi="Latha" w:cs="Latha"/>
-                <w:szCs w:val="28"/>
-                <w:highlight w:val="green"/>
-                <w:cs/>
-                <w:lang w:bidi="ta-IN"/>
-              </w:rPr>
-              <w:t>ய</w:t>
-            </w:r>
-            <w:r>
-              <w:rPr>
-                <w:rFonts w:ascii="BRH Tamil Tab Extra" w:hAnsi="BRH Tamil Tab Extra" w:cs="Latha"/>
-                <w:b/>
-                <w:bCs/>
-                <w:sz w:val="32"/>
-                <w:szCs w:val="28"/>
-                <w:highlight w:val="green"/>
-                <w:lang w:bidi="ta-IN"/>
-              </w:rPr>
-              <w:t>‡</w:t>
-            </w:r>
-            <w:r>
-              <w:rPr>
-                <w:rFonts w:ascii="Latha" w:hAnsi="Latha" w:cs="Latha"/>
-                <w:szCs w:val="28"/>
-                <w:cs/>
-                <w:lang w:bidi="ta-IN"/>
-              </w:rPr>
-              <w:t>ன் த்</w:t>
-            </w:r>
-            <w:r>
-              <w:rPr>
-                <w:rFonts w:ascii="Latha" w:hAnsi="Latha" w:cs="Latha"/>
-                <w:b/>
-                <w:bCs/>
-                <w:position w:val="-12"/>
-                <w:szCs w:val="28"/>
-                <w:cs/>
-                <w:lang w:bidi="ta-IN"/>
-              </w:rPr>
-              <w:t>2</w:t>
-            </w:r>
-            <w:r>
-              <w:rPr>
-                <w:rFonts w:ascii="Latha" w:hAnsi="Latha" w:cs="Latha"/>
-                <w:szCs w:val="28"/>
-                <w:cs/>
-                <w:lang w:bidi="ta-IN"/>
-              </w:rPr>
-              <w:t>ஸ்த</w:t>
-            </w:r>
-            <w:r>
-              <w:rPr>
-                <w:rFonts w:ascii="BRH Tamil Tab Extra" w:hAnsi="BRH Tamil Tab Extra" w:cs="Latha"/>
-                <w:b/>
-                <w:bCs/>
-                <w:sz w:val="32"/>
-                <w:szCs w:val="28"/>
-                <w:lang w:bidi="ta-IN"/>
-              </w:rPr>
-              <w:t>…</w:t>
-            </w:r>
-            <w:r>
-              <w:rPr>
-                <w:rFonts w:ascii="Latha" w:hAnsi="Latha" w:cs="Latha"/>
-                <w:szCs w:val="28"/>
-                <w:cs/>
-                <w:lang w:bidi="ta-IN"/>
-              </w:rPr>
-              <w:t>னய</w:t>
-            </w:r>
-            <w:r>
-              <w:rPr>
-                <w:rFonts w:ascii="BRH Tamil Tab Extra" w:hAnsi="BRH Tamil Tab Extra" w:cs="Latha"/>
-                <w:b/>
-                <w:bCs/>
-                <w:sz w:val="32"/>
-                <w:szCs w:val="28"/>
-                <w:lang w:bidi="ta-IN"/>
-              </w:rPr>
-              <w:t>†</w:t>
-            </w:r>
-            <w:r>
-              <w:rPr>
-                <w:rFonts w:ascii="Latha" w:hAnsi="Latha" w:cs="Latha"/>
-                <w:szCs w:val="28"/>
-                <w:cs/>
-                <w:lang w:bidi="ta-IN"/>
-              </w:rPr>
-              <w:t>ன் ந</w:t>
-            </w:r>
-            <w:r>
-              <w:rPr>
-                <w:rFonts w:ascii="BRH Tamil Tab Extra" w:hAnsi="BRH Tamil Tab Extra" w:cs="Latha"/>
-                <w:b/>
-                <w:bCs/>
-                <w:sz w:val="32"/>
-                <w:szCs w:val="28"/>
-                <w:lang w:bidi="ta-IN"/>
-              </w:rPr>
-              <w:t>…</w:t>
-            </w:r>
-            <w:r>
-              <w:rPr>
-                <w:rFonts w:ascii="Latha" w:hAnsi="Latha" w:cs="Latha"/>
-                <w:szCs w:val="28"/>
-                <w:cs/>
-                <w:lang w:bidi="ta-IN"/>
-              </w:rPr>
-              <w:t>க்</w:t>
-            </w:r>
-            <w:r>
-              <w:rPr>
-                <w:rFonts w:ascii="Latha" w:hAnsi="Latha" w:cs="Latha"/>
-                <w:b/>
-                <w:bCs/>
-                <w:position w:val="-12"/>
-                <w:szCs w:val="28"/>
-                <w:cs/>
-                <w:lang w:bidi="ta-IN"/>
-              </w:rPr>
-              <w:t>3</w:t>
-            </w:r>
-            <w:r>
-              <w:rPr>
-                <w:rFonts w:ascii="Latha" w:hAnsi="Latha" w:cs="Latha"/>
-                <w:szCs w:val="28"/>
-                <w:cs/>
-                <w:lang w:bidi="ta-IN"/>
-              </w:rPr>
-              <w:t>னி ர</w:t>
-            </w:r>
-            <w:r>
-              <w:rPr>
-                <w:rFonts w:ascii="BRH Tamil Tab Extra" w:hAnsi="BRH Tamil Tab Extra" w:cs="Latha"/>
-                <w:b/>
-                <w:bCs/>
-                <w:sz w:val="32"/>
-                <w:szCs w:val="28"/>
-                <w:lang w:bidi="ta-IN"/>
-              </w:rPr>
-              <w:t>…</w:t>
-            </w:r>
-            <w:r>
-              <w:rPr>
-                <w:rFonts w:ascii="Latha" w:hAnsi="Latha" w:cs="Latha"/>
-                <w:szCs w:val="28"/>
-                <w:cs/>
-                <w:lang w:bidi="ta-IN"/>
-              </w:rPr>
-              <w:t>க்</w:t>
-            </w:r>
-            <w:r>
-              <w:rPr>
-                <w:rFonts w:ascii="Latha" w:hAnsi="Latha" w:cs="Latha"/>
-                <w:b/>
-                <w:bCs/>
-                <w:position w:val="-12"/>
-                <w:szCs w:val="28"/>
-                <w:cs/>
-                <w:lang w:bidi="ta-IN"/>
-              </w:rPr>
-              <w:t>3</w:t>
-            </w:r>
-            <w:r>
-              <w:rPr>
-                <w:rFonts w:ascii="Latha" w:hAnsi="Latha" w:cs="Latha"/>
-                <w:szCs w:val="28"/>
-                <w:cs/>
-                <w:lang w:bidi="ta-IN"/>
-              </w:rPr>
-              <w:t>னி</w:t>
-            </w:r>
-            <w:r>
-              <w:rPr>
-                <w:rFonts w:ascii="Latha" w:hAnsi="Latha" w:cs="Latha"/>
-                <w:b/>
-                <w:bCs/>
-                <w:szCs w:val="28"/>
-                <w:cs/>
-                <w:lang w:bidi="ta-IN"/>
-              </w:rPr>
-              <w:t>:</w:t>
-            </w:r>
-            <w:r>
-              <w:rPr>
-                <w:rFonts w:ascii="Latha" w:hAnsi="Latha" w:cs="Latha"/>
-                <w:szCs w:val="28"/>
-                <w:cs/>
-                <w:lang w:bidi="ta-IN"/>
-              </w:rPr>
-              <w:t xml:space="preserve"> ஸ்த</w:t>
-            </w:r>
-            <w:r>
-              <w:rPr>
-                <w:rFonts w:ascii="BRH Tamil Tab Extra" w:hAnsi="BRH Tamil Tab Extra" w:cs="Latha"/>
-                <w:b/>
-                <w:bCs/>
-                <w:sz w:val="32"/>
-                <w:szCs w:val="28"/>
-                <w:lang w:bidi="ta-IN"/>
-              </w:rPr>
-              <w:t>…</w:t>
-            </w:r>
-            <w:r>
-              <w:rPr>
-                <w:rFonts w:ascii="Latha" w:hAnsi="Latha" w:cs="Latha"/>
-                <w:szCs w:val="28"/>
-                <w:cs/>
-                <w:lang w:bidi="ta-IN"/>
-              </w:rPr>
-              <w:t>னயன்ன்</w:t>
-            </w:r>
-            <w:r>
-              <w:rPr>
-                <w:rFonts w:ascii="BRH Tamil Tab Extra" w:hAnsi="BRH Tamil Tab Extra" w:cs="Latha"/>
-                <w:b/>
-                <w:bCs/>
-                <w:sz w:val="32"/>
-                <w:szCs w:val="28"/>
-                <w:lang w:bidi="ta-IN"/>
-              </w:rPr>
-              <w:t>†</w:t>
-            </w:r>
-            <w:r>
-              <w:rPr>
-                <w:rFonts w:ascii="Latha" w:hAnsi="Latha" w:cs="Latha"/>
-                <w:szCs w:val="28"/>
-                <w:lang w:bidi="ta-IN"/>
-              </w:rPr>
-              <w:t xml:space="preserve"> |</w:t>
-            </w:r>
           </w:p>
           <w:p>
             <w:pPr>
@@ -28232,6 +29048,7 @@
                 <w:cs/>
                 <w:lang w:bidi="ta-IN"/>
               </w:rPr>
+              <w:lastRenderedPageBreak/>
               <w:t>32</w:t>
             </w:r>
             <w:r>
@@ -28655,6 +29472,7 @@
                 <w:cs/>
                 <w:lang w:bidi="ta-IN"/>
               </w:rPr>
+              <w:lastRenderedPageBreak/>
               <w:t>5</w:t>
             </w:r>
             <w:r>
@@ -29725,16 +30543,68 @@
                 <w:highlight w:val="green"/>
                 <w:lang w:bidi="ta-IN"/>
               </w:rPr>
-              <w:t>is udAttam</w:t>
-            </w:r>
+              <w:t xml:space="preserve">is </w:t>
+            </w:r>
+            <w:proofErr w:type="spellStart"/>
             <w:r>
               <w:rPr>
                 <w:rFonts w:cs="Arial"/>
                 <w:sz w:val="28"/>
                 <w:szCs w:val="28"/>
-                <w:lang w:bidi="ta-IN"/>
-              </w:rPr>
-              <w:t xml:space="preserve"> should not acquire anudAttam should be udAttam only</w:t>
+                <w:highlight w:val="green"/>
+                <w:lang w:bidi="ta-IN"/>
+              </w:rPr>
+              <w:t>udAttam</w:t>
+            </w:r>
+            <w:proofErr w:type="spellEnd"/>
+            <w:r>
+              <w:rPr>
+                <w:rFonts w:cs="Arial"/>
+                <w:sz w:val="28"/>
+                <w:szCs w:val="28"/>
+                <w:lang w:bidi="ta-IN"/>
+              </w:rPr>
+              <w:t xml:space="preserve"> should not acquire </w:t>
+            </w:r>
+            <w:proofErr w:type="spellStart"/>
+            <w:r>
+              <w:rPr>
+                <w:rFonts w:cs="Arial"/>
+                <w:sz w:val="28"/>
+                <w:szCs w:val="28"/>
+                <w:lang w:bidi="ta-IN"/>
+              </w:rPr>
+              <w:t>anudAttam</w:t>
+            </w:r>
+            <w:proofErr w:type="spellEnd"/>
+            <w:r>
+              <w:rPr>
+                <w:rFonts w:cs="Arial"/>
+                <w:sz w:val="28"/>
+                <w:szCs w:val="28"/>
+                <w:lang w:bidi="ta-IN"/>
+              </w:rPr>
+              <w:t xml:space="preserve"> should be </w:t>
+            </w:r>
+            <w:proofErr w:type="spellStart"/>
+            <w:r>
+              <w:rPr>
+                <w:rFonts w:cs="Arial"/>
+                <w:sz w:val="28"/>
+                <w:szCs w:val="28"/>
+                <w:lang w:bidi="ta-IN"/>
+              </w:rPr>
+              <w:t>udAttam</w:t>
+            </w:r>
+            <w:proofErr w:type="spellEnd"/>
+            <w:r>
+              <w:rPr>
+                <w:rFonts w:cs="Arial"/>
+                <w:sz w:val="28"/>
+                <w:szCs w:val="28"/>
+                <w:lang w:bidi="ta-IN"/>
+              </w:rPr>
+              <w:t xml:space="preserve"> only</w:t>
             </w:r>
           </w:p>
         </w:tc>
@@ -29767,7 +30637,6 @@
                 <w:cs/>
                 <w:lang w:bidi="ta-IN"/>
               </w:rPr>
-              <w:lastRenderedPageBreak/>
               <w:t>36</w:t>
             </w:r>
             <w:r>
@@ -31365,6 +32234,7 @@
                 <w:cs/>
                 <w:lang w:bidi="ta-IN"/>
               </w:rPr>
+              <w:lastRenderedPageBreak/>
               <w:t>47</w:t>
             </w:r>
             <w:r>

</xml_diff>